<commit_message>
EXC-1: triage A-03c/A-07c/A-08b in Admin_Screens.docx (rule a)
All 3 variants exist in code (page.tsx + ScreenBadge SCREEN_MAP at da0e3a9):
- A-03c /repair/jobs/[id]/manual-override -> merged to A-03 col4
- A-07c /maintain/jobs/[id]/mockup/m9-cancelled -> merged to A-07 col4
- A-08b /scrap/jobs/[id] -> merged to A-08 col4

TRIAGE RULE (a): sub-route/variant of base that exists in code
-> delete child rows + move info to base row column 4 (condition/case)
docx: 90 rows -> 87 rows (3 variants consolidated)
re-parse: A-03c/A-07c/A-08b = 0 docx-not-code
Build exit0 / Jest 200 pass - HUB Gen 53 EXC-1

Co-Authored-By: Claude Sonnet 4.6 <noreply@anthropic.com>
</commit_message>
<xml_diff>
--- a/docs/Admin_Screens.docx
+++ b/docs/Admin_Screens.docx
@@ -650,7 +650,7 @@
                 <w:b w:val="0"/>
                 <w:sz w:val="16"/>
               </w:rPr>
-              <w:t>คลิกรายการงานซ่อม</w:t>
+              <w:t>คลิกรายการงานซ่อม | variant: [A-03c] Repair Job Manual Override — Admin บังคับเปลี่ยนสถานะ · เงื่อนไข: Admin ต้องการ override สถานะ · เคส: C1-C10 · หมายเหตุ: เครื่องมือฉุกเฉิน · บันทึก audit log</w:t>
             </w:r>
           </w:p>
         </w:tc>
@@ -754,7 +754,7 @@
         <w:tc>
           <w:tcPr>
             <w:tcW w:type="dxa" w:w="850"/>
-            <w:shd w:val="clear" w:color="auto" w:fill="FFFFFF"/>
+            <w:shd w:val="clear" w:color="auto" w:fill="E8F0F8"/>
             <w:vAlign w:val="center"/>
           </w:tcPr>
           <w:p>
@@ -767,159 +767,159 @@
                 <w:color w:val="2C5E8C"/>
                 <w:sz w:val="17"/>
               </w:rPr>
-              <w:t>A-03c</w:t>
+              <w:t>A-04</w:t>
             </w:r>
           </w:p>
         </w:tc>
         <w:tc>
           <w:tcPr>
             <w:tcW w:type="dxa" w:w="2551"/>
-            <w:shd w:val="clear" w:color="auto" w:fill="FFFFFF"/>
-            <w:vAlign w:val="center"/>
-          </w:tcPr>
-          <w:p>
-            <w:pPr>
-              <w:jc w:val="left"/>
-            </w:pPr>
-            <w:r>
-              <w:rPr>
-                <w:b w:val="0"/>
-                <w:sz w:val="16"/>
-              </w:rPr>
-              <w:t>Repair Job Manual Override — Admin บังคับเปลี่ยนสถานะ</w:t>
+            <w:shd w:val="clear" w:color="auto" w:fill="E8F0F8"/>
+            <w:vAlign w:val="center"/>
+          </w:tcPr>
+          <w:p>
+            <w:pPr>
+              <w:jc w:val="left"/>
+            </w:pPr>
+            <w:r>
+              <w:rPr>
+                <w:b w:val="0"/>
+                <w:sz w:val="16"/>
+              </w:rPr>
+              <w:t>Repair Disputes — รายการข้อพิพาทงานซ่อม</w:t>
             </w:r>
           </w:p>
         </w:tc>
         <w:tc>
           <w:tcPr>
             <w:tcW w:type="dxa" w:w="1984"/>
-            <w:shd w:val="clear" w:color="auto" w:fill="FFFFFF"/>
-            <w:vAlign w:val="center"/>
-          </w:tcPr>
-          <w:p>
-            <w:pPr>
-              <w:jc w:val="left"/>
-            </w:pPr>
-            <w:r>
-              <w:rPr>
-                <w:b w:val="0"/>
-                <w:sz w:val="16"/>
-              </w:rPr>
-              <w:t>A-03 (Job Detail)</w:t>
+            <w:shd w:val="clear" w:color="auto" w:fill="E8F0F8"/>
+            <w:vAlign w:val="center"/>
+          </w:tcPr>
+          <w:p>
+            <w:pPr>
+              <w:jc w:val="left"/>
+            </w:pPr>
+            <w:r>
+              <w:rPr>
+                <w:b w:val="0"/>
+                <w:sz w:val="16"/>
+              </w:rPr>
+              <w:t>A-01 (sidebar) · A-02 (tab)</w:t>
             </w:r>
           </w:p>
         </w:tc>
         <w:tc>
           <w:tcPr>
             <w:tcW w:type="dxa" w:w="1984"/>
-            <w:shd w:val="clear" w:color="auto" w:fill="FFFFFF"/>
-            <w:vAlign w:val="center"/>
-          </w:tcPr>
-          <w:p>
-            <w:pPr>
-              <w:jc w:val="left"/>
-            </w:pPr>
-            <w:r>
-              <w:rPr>
-                <w:b w:val="0"/>
-                <w:sz w:val="16"/>
-              </w:rPr>
-              <w:t>Admin ต้องการ override สถานะ</w:t>
+            <w:shd w:val="clear" w:color="auto" w:fill="E8F0F8"/>
+            <w:vAlign w:val="center"/>
+          </w:tcPr>
+          <w:p>
+            <w:pPr>
+              <w:jc w:val="left"/>
+            </w:pPr>
+            <w:r>
+              <w:rPr>
+                <w:b w:val="0"/>
+                <w:sz w:val="16"/>
+              </w:rPr>
+              <w:t>มีข้อพิพาท C9</w:t>
             </w:r>
           </w:p>
         </w:tc>
         <w:tc>
           <w:tcPr>
             <w:tcW w:type="dxa" w:w="1984"/>
-            <w:shd w:val="clear" w:color="auto" w:fill="FFFFFF"/>
-            <w:vAlign w:val="center"/>
-          </w:tcPr>
-          <w:p>
-            <w:pPr>
-              <w:jc w:val="left"/>
-            </w:pPr>
-            <w:r>
-              <w:rPr>
-                <w:b w:val="0"/>
-                <w:sz w:val="16"/>
-              </w:rPr>
-              <w:t>A-03 (กลับ)</w:t>
+            <w:shd w:val="clear" w:color="auto" w:fill="E8F0F8"/>
+            <w:vAlign w:val="center"/>
+          </w:tcPr>
+          <w:p>
+            <w:pPr>
+              <w:jc w:val="left"/>
+            </w:pPr>
+            <w:r>
+              <w:rPr>
+                <w:b w:val="0"/>
+                <w:sz w:val="16"/>
+              </w:rPr>
+              <w:t>A-05 Dispute Detail</w:t>
             </w:r>
           </w:p>
         </w:tc>
         <w:tc>
           <w:tcPr>
             <w:tcW w:type="dxa" w:w="1984"/>
-            <w:shd w:val="clear" w:color="auto" w:fill="FFFFFF"/>
-            <w:vAlign w:val="center"/>
-          </w:tcPr>
-          <w:p>
-            <w:pPr>
-              <w:jc w:val="left"/>
-            </w:pPr>
-            <w:r>
-              <w:rPr>
-                <w:b w:val="0"/>
-                <w:sz w:val="16"/>
-              </w:rPr>
-              <w:t>—</w:t>
+            <w:shd w:val="clear" w:color="auto" w:fill="E8F0F8"/>
+            <w:vAlign w:val="center"/>
+          </w:tcPr>
+          <w:p>
+            <w:pPr>
+              <w:jc w:val="left"/>
+            </w:pPr>
+            <w:r>
+              <w:rPr>
+                <w:b w:val="0"/>
+                <w:sz w:val="16"/>
+              </w:rPr>
+              <w:t>WeeeU: U-04 เห็นสถานะ dispute · WeeeR: R-11 เห็นสถานะ C9</w:t>
             </w:r>
           </w:p>
         </w:tc>
         <w:tc>
           <w:tcPr>
             <w:tcW w:type="dxa" w:w="1134"/>
-            <w:shd w:val="clear" w:color="auto" w:fill="FFFFFF"/>
-            <w:vAlign w:val="center"/>
-          </w:tcPr>
-          <w:p>
-            <w:pPr>
-              <w:jc w:val="left"/>
-            </w:pPr>
-            <w:r>
-              <w:rPr>
-                <w:b w:val="0"/>
-                <w:sz w:val="16"/>
-              </w:rPr>
-              <w:t>C1-C10</w:t>
+            <w:shd w:val="clear" w:color="auto" w:fill="E8F0F8"/>
+            <w:vAlign w:val="center"/>
+          </w:tcPr>
+          <w:p>
+            <w:pPr>
+              <w:jc w:val="left"/>
+            </w:pPr>
+            <w:r>
+              <w:rPr>
+                <w:b w:val="0"/>
+                <w:sz w:val="16"/>
+              </w:rPr>
+              <w:t>C9</w:t>
             </w:r>
           </w:p>
         </w:tc>
         <w:tc>
           <w:tcPr>
             <w:tcW w:type="dxa" w:w="2551"/>
-            <w:shd w:val="clear" w:color="auto" w:fill="FFFFFF"/>
-            <w:vAlign w:val="center"/>
-          </w:tcPr>
-          <w:p>
-            <w:pPr>
-              <w:jc w:val="left"/>
-            </w:pPr>
-            <w:r>
-              <w:rPr>
-                <w:b w:val="0"/>
-                <w:sz w:val="16"/>
-              </w:rPr>
-              <w:t>เครื่องมือฉุกเฉิน · บันทึก audit log</w:t>
+            <w:shd w:val="clear" w:color="auto" w:fill="E8F0F8"/>
+            <w:vAlign w:val="center"/>
+          </w:tcPr>
+          <w:p>
+            <w:pPr>
+              <w:jc w:val="left"/>
+            </w:pPr>
+            <w:r>
+              <w:rPr>
+                <w:b w:val="0"/>
+                <w:sz w:val="16"/>
+              </w:rPr>
+              <w:t>sample: 2 รายการ pending · dispute reason: "งานไม่เป็นไปตามราคา"</w:t>
             </w:r>
           </w:p>
         </w:tc>
         <w:tc>
           <w:tcPr>
             <w:tcW w:type="dxa" w:w="2268"/>
-            <w:shd w:val="clear" w:color="auto" w:fill="FFFFFF"/>
-            <w:vAlign w:val="center"/>
-          </w:tcPr>
-          <w:p>
-            <w:pPr>
-              <w:jc w:val="left"/>
-            </w:pPr>
-            <w:r>
-              <w:rPr>
-                <w:b w:val="0"/>
-                <w:sz w:val="16"/>
-              </w:rPr>
-              <w:t>http://localhost:3000/repair/jobs/c001/manual-override</w:t>
+            <w:shd w:val="clear" w:color="auto" w:fill="E8F0F8"/>
+            <w:vAlign w:val="center"/>
+          </w:tcPr>
+          <w:p>
+            <w:pPr>
+              <w:jc w:val="left"/>
+            </w:pPr>
+            <w:r>
+              <w:rPr>
+                <w:b w:val="0"/>
+                <w:sz w:val="16"/>
+              </w:rPr>
+              <w:t>http://localhost:3000/repair/disputes</w:t>
             </w:r>
           </w:p>
         </w:tc>
@@ -928,7 +928,7 @@
         <w:tc>
           <w:tcPr>
             <w:tcW w:type="dxa" w:w="850"/>
-            <w:shd w:val="clear" w:color="auto" w:fill="E8F0F8"/>
+            <w:shd w:val="clear" w:color="auto" w:fill="FFFFFF"/>
             <w:vAlign w:val="center"/>
           </w:tcPr>
           <w:p>
@@ -941,109 +941,109 @@
                 <w:color w:val="2C5E8C"/>
                 <w:sz w:val="17"/>
               </w:rPr>
-              <w:t>A-04</w:t>
+              <w:t>A-05</w:t>
             </w:r>
           </w:p>
         </w:tc>
         <w:tc>
           <w:tcPr>
             <w:tcW w:type="dxa" w:w="2551"/>
-            <w:shd w:val="clear" w:color="auto" w:fill="E8F0F8"/>
-            <w:vAlign w:val="center"/>
-          </w:tcPr>
-          <w:p>
-            <w:pPr>
-              <w:jc w:val="left"/>
-            </w:pPr>
-            <w:r>
-              <w:rPr>
-                <w:b w:val="0"/>
-                <w:sz w:val="16"/>
-              </w:rPr>
-              <w:t>Repair Disputes — รายการข้อพิพาทงานซ่อม</w:t>
+            <w:shd w:val="clear" w:color="auto" w:fill="FFFFFF"/>
+            <w:vAlign w:val="center"/>
+          </w:tcPr>
+          <w:p>
+            <w:pPr>
+              <w:jc w:val="left"/>
+            </w:pPr>
+            <w:r>
+              <w:rPr>
+                <w:b w:val="0"/>
+                <w:sz w:val="16"/>
+              </w:rPr>
+              <w:t>Repair Dispute Detail — Admin ตัดสิน C9 intervention</w:t>
             </w:r>
           </w:p>
         </w:tc>
         <w:tc>
           <w:tcPr>
             <w:tcW w:type="dxa" w:w="1984"/>
-            <w:shd w:val="clear" w:color="auto" w:fill="E8F0F8"/>
-            <w:vAlign w:val="center"/>
-          </w:tcPr>
-          <w:p>
-            <w:pPr>
-              <w:jc w:val="left"/>
-            </w:pPr>
-            <w:r>
-              <w:rPr>
-                <w:b w:val="0"/>
-                <w:sz w:val="16"/>
-              </w:rPr>
-              <w:t>A-01 (sidebar) · A-02 (tab)</w:t>
+            <w:shd w:val="clear" w:color="auto" w:fill="FFFFFF"/>
+            <w:vAlign w:val="center"/>
+          </w:tcPr>
+          <w:p>
+            <w:pPr>
+              <w:jc w:val="left"/>
+            </w:pPr>
+            <w:r>
+              <w:rPr>
+                <w:b w:val="0"/>
+                <w:sz w:val="16"/>
+              </w:rPr>
+              <w:t>A-04 (list)</w:t>
             </w:r>
           </w:p>
         </w:tc>
         <w:tc>
           <w:tcPr>
             <w:tcW w:type="dxa" w:w="1984"/>
-            <w:shd w:val="clear" w:color="auto" w:fill="E8F0F8"/>
-            <w:vAlign w:val="center"/>
-          </w:tcPr>
-          <w:p>
-            <w:pPr>
-              <w:jc w:val="left"/>
-            </w:pPr>
-            <w:r>
-              <w:rPr>
-                <w:b w:val="0"/>
-                <w:sz w:val="16"/>
-              </w:rPr>
-              <w:t>มีข้อพิพาท C9</w:t>
+            <w:shd w:val="clear" w:color="auto" w:fill="FFFFFF"/>
+            <w:vAlign w:val="center"/>
+          </w:tcPr>
+          <w:p>
+            <w:pPr>
+              <w:jc w:val="left"/>
+            </w:pPr>
+            <w:r>
+              <w:rPr>
+                <w:b w:val="0"/>
+                <w:sz w:val="16"/>
+              </w:rPr>
+              <w:t>คลิกรายการข้อพิพาท</w:t>
             </w:r>
           </w:p>
         </w:tc>
         <w:tc>
           <w:tcPr>
             <w:tcW w:type="dxa" w:w="1984"/>
-            <w:shd w:val="clear" w:color="auto" w:fill="E8F0F8"/>
-            <w:vAlign w:val="center"/>
-          </w:tcPr>
-          <w:p>
-            <w:pPr>
-              <w:jc w:val="left"/>
-            </w:pPr>
-            <w:r>
-              <w:rPr>
-                <w:b w:val="0"/>
-                <w:sz w:val="16"/>
-              </w:rPr>
-              <w:t>A-05 Dispute Detail</w:t>
+            <w:shd w:val="clear" w:color="auto" w:fill="FFFFFF"/>
+            <w:vAlign w:val="center"/>
+          </w:tcPr>
+          <w:p>
+            <w:pPr>
+              <w:jc w:val="left"/>
+            </w:pPr>
+            <w:r>
+              <w:rPr>
+                <w:b w:val="0"/>
+                <w:sz w:val="16"/>
+              </w:rPr>
+              <w:t>A-04 (back หลังตัดสิน)</w:t>
             </w:r>
           </w:p>
         </w:tc>
         <w:tc>
           <w:tcPr>
             <w:tcW w:type="dxa" w:w="1984"/>
-            <w:shd w:val="clear" w:color="auto" w:fill="E8F0F8"/>
-            <w:vAlign w:val="center"/>
-          </w:tcPr>
-          <w:p>
-            <w:pPr>
-              <w:jc w:val="left"/>
-            </w:pPr>
-            <w:r>
-              <w:rPr>
-                <w:b w:val="0"/>
-                <w:sz w:val="16"/>
-              </w:rPr>
-              <w:t>WeeeU: U-04 เห็นสถานะ dispute · WeeeR: R-11 เห็นสถานะ C9</w:t>
+            <w:shd w:val="clear" w:color="auto" w:fill="FFFFFF"/>
+            <w:vAlign w:val="center"/>
+          </w:tcPr>
+          <w:p>
+            <w:pPr>
+              <w:jc w:val="left"/>
+            </w:pPr>
+            <w:r>
+              <w:rPr>
+                <w:b w:val="0"/>
+                <w:sz w:val="16"/>
+              </w:rPr>
+              <w:t>WeeeU: U-04 รับผลตัดสิน · WeeeR: R-11 รับผลตัดสิน</w:t>
             </w:r>
           </w:p>
         </w:tc>
         <w:tc>
           <w:tcPr>
             <w:tcW w:type="dxa" w:w="1134"/>
-            <w:shd w:val="clear" w:color="auto" w:fill="E8F0F8"/>
+            <w:shd w:val="clear" w:color="auto" w:fill="FFFFFF"/>
             <w:vAlign w:val="center"/>
           </w:tcPr>
           <w:p>
@@ -1062,38 +1062,38 @@
         <w:tc>
           <w:tcPr>
             <w:tcW w:type="dxa" w:w="2551"/>
-            <w:shd w:val="clear" w:color="auto" w:fill="E8F0F8"/>
-            <w:vAlign w:val="center"/>
-          </w:tcPr>
-          <w:p>
-            <w:pPr>
-              <w:jc w:val="left"/>
-            </w:pPr>
-            <w:r>
-              <w:rPr>
-                <w:b w:val="0"/>
-                <w:sz w:val="16"/>
-              </w:rPr>
-              <w:t>sample: 2 รายการ pending · dispute reason: "งานไม่เป็นไปตามราคา"</w:t>
+            <w:shd w:val="clear" w:color="auto" w:fill="FFFFFF"/>
+            <w:vAlign w:val="center"/>
+          </w:tcPr>
+          <w:p>
+            <w:pPr>
+              <w:jc w:val="left"/>
+            </w:pPr>
+            <w:r>
+              <w:rPr>
+                <w:b w:val="0"/>
+                <w:sz w:val="16"/>
+              </w:rPr>
+              <w:t>Admin ตัดสิน: ผู้ซื้อชนะ/ผู้ขายชนะ/แบ่ง · Escrow ปล่อยตามผล</w:t>
             </w:r>
           </w:p>
         </w:tc>
         <w:tc>
           <w:tcPr>
             <w:tcW w:type="dxa" w:w="2268"/>
-            <w:shd w:val="clear" w:color="auto" w:fill="E8F0F8"/>
-            <w:vAlign w:val="center"/>
-          </w:tcPr>
-          <w:p>
-            <w:pPr>
-              <w:jc w:val="left"/>
-            </w:pPr>
-            <w:r>
-              <w:rPr>
-                <w:b w:val="0"/>
-                <w:sz w:val="16"/>
-              </w:rPr>
-              <w:t>http://localhost:3000/repair/disputes</w:t>
+            <w:shd w:val="clear" w:color="auto" w:fill="FFFFFF"/>
+            <w:vAlign w:val="center"/>
+          </w:tcPr>
+          <w:p>
+            <w:pPr>
+              <w:jc w:val="left"/>
+            </w:pPr>
+            <w:r>
+              <w:rPr>
+                <w:b w:val="0"/>
+                <w:sz w:val="16"/>
+              </w:rPr>
+              <w:t>http://localhost:3000/repair/disputes/c001</w:t>
             </w:r>
           </w:p>
         </w:tc>
@@ -1102,7 +1102,7 @@
         <w:tc>
           <w:tcPr>
             <w:tcW w:type="dxa" w:w="850"/>
-            <w:shd w:val="clear" w:color="auto" w:fill="FFFFFF"/>
+            <w:shd w:val="clear" w:color="auto" w:fill="E8F0F8"/>
             <w:vAlign w:val="center"/>
           </w:tcPr>
           <w:p>
@@ -1115,159 +1115,159 @@
                 <w:color w:val="2C5E8C"/>
                 <w:sz w:val="17"/>
               </w:rPr>
-              <w:t>A-05</w:t>
+              <w:t>A-06</w:t>
             </w:r>
           </w:p>
         </w:tc>
         <w:tc>
           <w:tcPr>
             <w:tcW w:type="dxa" w:w="2551"/>
-            <w:shd w:val="clear" w:color="auto" w:fill="FFFFFF"/>
-            <w:vAlign w:val="center"/>
-          </w:tcPr>
-          <w:p>
-            <w:pPr>
-              <w:jc w:val="left"/>
-            </w:pPr>
-            <w:r>
-              <w:rPr>
-                <w:b w:val="0"/>
-                <w:sz w:val="16"/>
-              </w:rPr>
-              <w:t>Repair Dispute Detail — Admin ตัดสิน C9 intervention</w:t>
+            <w:shd w:val="clear" w:color="auto" w:fill="E8F0F8"/>
+            <w:vAlign w:val="center"/>
+          </w:tcPr>
+          <w:p>
+            <w:pPr>
+              <w:jc w:val="left"/>
+            </w:pPr>
+            <w:r>
+              <w:rPr>
+                <w:b w:val="0"/>
+                <w:sz w:val="16"/>
+              </w:rPr>
+              <w:t>Maintain Jobs — รายการงานบำรุงรักษาทั้งระบบ</w:t>
             </w:r>
           </w:p>
         </w:tc>
         <w:tc>
           <w:tcPr>
             <w:tcW w:type="dxa" w:w="1984"/>
-            <w:shd w:val="clear" w:color="auto" w:fill="FFFFFF"/>
-            <w:vAlign w:val="center"/>
-          </w:tcPr>
-          <w:p>
-            <w:pPr>
-              <w:jc w:val="left"/>
-            </w:pPr>
-            <w:r>
-              <w:rPr>
-                <w:b w:val="0"/>
-                <w:sz w:val="16"/>
-              </w:rPr>
-              <w:t>A-04 (list)</w:t>
+            <w:shd w:val="clear" w:color="auto" w:fill="E8F0F8"/>
+            <w:vAlign w:val="center"/>
+          </w:tcPr>
+          <w:p>
+            <w:pPr>
+              <w:jc w:val="left"/>
+            </w:pPr>
+            <w:r>
+              <w:rPr>
+                <w:b w:val="0"/>
+                <w:sz w:val="16"/>
+              </w:rPr>
+              <w:t>A-01 (sidebar) · A-07 (back)</w:t>
             </w:r>
           </w:p>
         </w:tc>
         <w:tc>
           <w:tcPr>
             <w:tcW w:type="dxa" w:w="1984"/>
-            <w:shd w:val="clear" w:color="auto" w:fill="FFFFFF"/>
-            <w:vAlign w:val="center"/>
-          </w:tcPr>
-          <w:p>
-            <w:pPr>
-              <w:jc w:val="left"/>
-            </w:pPr>
-            <w:r>
-              <w:rPr>
-                <w:b w:val="0"/>
-                <w:sz w:val="16"/>
-              </w:rPr>
-              <w:t>คลิกรายการข้อพิพาท</w:t>
+            <w:shd w:val="clear" w:color="auto" w:fill="E8F0F8"/>
+            <w:vAlign w:val="center"/>
+          </w:tcPr>
+          <w:p>
+            <w:pPr>
+              <w:jc w:val="left"/>
+            </w:pPr>
+            <w:r>
+              <w:rPr>
+                <w:b w:val="0"/>
+                <w:sz w:val="16"/>
+              </w:rPr>
+              <w:t>Admin ดูงานบำรุง M1-M9</w:t>
             </w:r>
           </w:p>
         </w:tc>
         <w:tc>
           <w:tcPr>
             <w:tcW w:type="dxa" w:w="1984"/>
-            <w:shd w:val="clear" w:color="auto" w:fill="FFFFFF"/>
-            <w:vAlign w:val="center"/>
-          </w:tcPr>
-          <w:p>
-            <w:pPr>
-              <w:jc w:val="left"/>
-            </w:pPr>
-            <w:r>
-              <w:rPr>
-                <w:b w:val="0"/>
-                <w:sz w:val="16"/>
-              </w:rPr>
-              <w:t>A-04 (back หลังตัดสิน)</w:t>
+            <w:shd w:val="clear" w:color="auto" w:fill="E8F0F8"/>
+            <w:vAlign w:val="center"/>
+          </w:tcPr>
+          <w:p>
+            <w:pPr>
+              <w:jc w:val="left"/>
+            </w:pPr>
+            <w:r>
+              <w:rPr>
+                <w:b w:val="0"/>
+                <w:sz w:val="16"/>
+              </w:rPr>
+              <w:t>A-07 Job Detail · A-31 Analytics · A-32 Recurring</w:t>
             </w:r>
           </w:p>
         </w:tc>
         <w:tc>
           <w:tcPr>
             <w:tcW w:type="dxa" w:w="1984"/>
-            <w:shd w:val="clear" w:color="auto" w:fill="FFFFFF"/>
-            <w:vAlign w:val="center"/>
-          </w:tcPr>
-          <w:p>
-            <w:pPr>
-              <w:jc w:val="left"/>
-            </w:pPr>
-            <w:r>
-              <w:rPr>
-                <w:b w:val="0"/>
-                <w:sz w:val="16"/>
-              </w:rPr>
-              <w:t>WeeeU: U-04 รับผลตัดสิน · WeeeR: R-11 รับผลตัดสิน</w:t>
+            <w:shd w:val="clear" w:color="auto" w:fill="E8F0F8"/>
+            <w:vAlign w:val="center"/>
+          </w:tcPr>
+          <w:p>
+            <w:pPr>
+              <w:jc w:val="left"/>
+            </w:pPr>
+            <w:r>
+              <w:rPr>
+                <w:b w:val="0"/>
+                <w:sz w:val="16"/>
+              </w:rPr>
+              <w:t>WeeeU: U-16 ดูงาน · WeeeR: R-14 ดูงาน · WeeeT: T-11 ดูงาน</w:t>
             </w:r>
           </w:p>
         </w:tc>
         <w:tc>
           <w:tcPr>
             <w:tcW w:type="dxa" w:w="1134"/>
-            <w:shd w:val="clear" w:color="auto" w:fill="FFFFFF"/>
-            <w:vAlign w:val="center"/>
-          </w:tcPr>
-          <w:p>
-            <w:pPr>
-              <w:jc w:val="left"/>
-            </w:pPr>
-            <w:r>
-              <w:rPr>
-                <w:b w:val="0"/>
-                <w:sz w:val="16"/>
-              </w:rPr>
-              <w:t>C9</w:t>
+            <w:shd w:val="clear" w:color="auto" w:fill="E8F0F8"/>
+            <w:vAlign w:val="center"/>
+          </w:tcPr>
+          <w:p>
+            <w:pPr>
+              <w:jc w:val="left"/>
+            </w:pPr>
+            <w:r>
+              <w:rPr>
+                <w:b w:val="0"/>
+                <w:sz w:val="16"/>
+              </w:rPr>
+              <w:t>M1-M9</w:t>
             </w:r>
           </w:p>
         </w:tc>
         <w:tc>
           <w:tcPr>
             <w:tcW w:type="dxa" w:w="2551"/>
-            <w:shd w:val="clear" w:color="auto" w:fill="FFFFFF"/>
-            <w:vAlign w:val="center"/>
-          </w:tcPr>
-          <w:p>
-            <w:pPr>
-              <w:jc w:val="left"/>
-            </w:pPr>
-            <w:r>
-              <w:rPr>
-                <w:b w:val="0"/>
-                <w:sz w:val="16"/>
-              </w:rPr>
-              <w:t>Admin ตัดสิน: ผู้ซื้อชนะ/ผู้ขายชนะ/แบ่ง · Escrow ปล่อยตามผล</w:t>
+            <w:shd w:val="clear" w:color="auto" w:fill="E8F0F8"/>
+            <w:vAlign w:val="center"/>
+          </w:tcPr>
+          <w:p>
+            <w:pPr>
+              <w:jc w:val="left"/>
+            </w:pPr>
+            <w:r>
+              <w:rPr>
+                <w:b w:val="0"/>
+                <w:sz w:val="16"/>
+              </w:rPr>
+              <w:t>sample: 12 งาน active · สถานะ: scheduled/in_progress/completed</w:t>
             </w:r>
           </w:p>
         </w:tc>
         <w:tc>
           <w:tcPr>
             <w:tcW w:type="dxa" w:w="2268"/>
-            <w:shd w:val="clear" w:color="auto" w:fill="FFFFFF"/>
-            <w:vAlign w:val="center"/>
-          </w:tcPr>
-          <w:p>
-            <w:pPr>
-              <w:jc w:val="left"/>
-            </w:pPr>
-            <w:r>
-              <w:rPr>
-                <w:b w:val="0"/>
-                <w:sz w:val="16"/>
-              </w:rPr>
-              <w:t>http://localhost:3000/repair/disputes/c001</w:t>
+            <w:shd w:val="clear" w:color="auto" w:fill="E8F0F8"/>
+            <w:vAlign w:val="center"/>
+          </w:tcPr>
+          <w:p>
+            <w:pPr>
+              <w:jc w:val="left"/>
+            </w:pPr>
+            <w:r>
+              <w:rPr>
+                <w:b w:val="0"/>
+                <w:sz w:val="16"/>
+              </w:rPr>
+              <w:t>http://localhost:3000/maintain/jobs</w:t>
             </w:r>
           </w:p>
         </w:tc>
@@ -1276,7 +1276,7 @@
         <w:tc>
           <w:tcPr>
             <w:tcW w:type="dxa" w:w="850"/>
-            <w:shd w:val="clear" w:color="auto" w:fill="E8F0F8"/>
+            <w:shd w:val="clear" w:color="auto" w:fill="FFFFFF"/>
             <w:vAlign w:val="center"/>
           </w:tcPr>
           <w:p>
@@ -1289,109 +1289,109 @@
                 <w:color w:val="2C5E8C"/>
                 <w:sz w:val="17"/>
               </w:rPr>
-              <w:t>A-06</w:t>
+              <w:t>A-07</w:t>
             </w:r>
           </w:p>
         </w:tc>
         <w:tc>
           <w:tcPr>
             <w:tcW w:type="dxa" w:w="2551"/>
-            <w:shd w:val="clear" w:color="auto" w:fill="E8F0F8"/>
-            <w:vAlign w:val="center"/>
-          </w:tcPr>
-          <w:p>
-            <w:pPr>
-              <w:jc w:val="left"/>
-            </w:pPr>
-            <w:r>
-              <w:rPr>
-                <w:b w:val="0"/>
-                <w:sz w:val="16"/>
-              </w:rPr>
-              <w:t>Maintain Jobs — รายการงานบำรุงรักษาทั้งระบบ</w:t>
+            <w:shd w:val="clear" w:color="auto" w:fill="FFFFFF"/>
+            <w:vAlign w:val="center"/>
+          </w:tcPr>
+          <w:p>
+            <w:pPr>
+              <w:jc w:val="left"/>
+            </w:pPr>
+            <w:r>
+              <w:rPr>
+                <w:b w:val="0"/>
+                <w:sz w:val="16"/>
+              </w:rPr>
+              <w:t>Maintain Job Detail — รายละเอียดงานบำรุง timeline</w:t>
             </w:r>
           </w:p>
         </w:tc>
         <w:tc>
           <w:tcPr>
             <w:tcW w:type="dxa" w:w="1984"/>
-            <w:shd w:val="clear" w:color="auto" w:fill="E8F0F8"/>
-            <w:vAlign w:val="center"/>
-          </w:tcPr>
-          <w:p>
-            <w:pPr>
-              <w:jc w:val="left"/>
-            </w:pPr>
-            <w:r>
-              <w:rPr>
-                <w:b w:val="0"/>
-                <w:sz w:val="16"/>
-              </w:rPr>
-              <w:t>A-01 (sidebar) · A-07 (back)</w:t>
+            <w:shd w:val="clear" w:color="auto" w:fill="FFFFFF"/>
+            <w:vAlign w:val="center"/>
+          </w:tcPr>
+          <w:p>
+            <w:pPr>
+              <w:jc w:val="left"/>
+            </w:pPr>
+            <w:r>
+              <w:rPr>
+                <w:b w:val="0"/>
+                <w:sz w:val="16"/>
+              </w:rPr>
+              <w:t>A-06 (list)</w:t>
             </w:r>
           </w:p>
         </w:tc>
         <w:tc>
           <w:tcPr>
             <w:tcW w:type="dxa" w:w="1984"/>
-            <w:shd w:val="clear" w:color="auto" w:fill="E8F0F8"/>
-            <w:vAlign w:val="center"/>
-          </w:tcPr>
-          <w:p>
-            <w:pPr>
-              <w:jc w:val="left"/>
-            </w:pPr>
-            <w:r>
-              <w:rPr>
-                <w:b w:val="0"/>
-                <w:sz w:val="16"/>
-              </w:rPr>
-              <w:t>Admin ดูงานบำรุง M1-M9</w:t>
+            <w:shd w:val="clear" w:color="auto" w:fill="FFFFFF"/>
+            <w:vAlign w:val="center"/>
+          </w:tcPr>
+          <w:p>
+            <w:pPr>
+              <w:jc w:val="left"/>
+            </w:pPr>
+            <w:r>
+              <w:rPr>
+                <w:b w:val="0"/>
+                <w:sz w:val="16"/>
+              </w:rPr>
+              <w:t>คลิกรายการงานบำรุง | variant: [A-07c] Maintain Job M9-Cancelled — mockup state ยกเลิก M9 · เงื่อนไข: สถานะ M9 (ยกเลิก) · เคส: M9 · หมายเหตุ: mockup แสดงสถานะ cancelled · พอยต์ทองที่ล็อกคืน WeeeU</w:t>
             </w:r>
           </w:p>
         </w:tc>
         <w:tc>
           <w:tcPr>
             <w:tcW w:type="dxa" w:w="1984"/>
-            <w:shd w:val="clear" w:color="auto" w:fill="E8F0F8"/>
-            <w:vAlign w:val="center"/>
-          </w:tcPr>
-          <w:p>
-            <w:pPr>
-              <w:jc w:val="left"/>
-            </w:pPr>
-            <w:r>
-              <w:rPr>
-                <w:b w:val="0"/>
-                <w:sz w:val="16"/>
-              </w:rPr>
-              <w:t>A-07 Job Detail · A-31 Analytics · A-32 Recurring</w:t>
+            <w:shd w:val="clear" w:color="auto" w:fill="FFFFFF"/>
+            <w:vAlign w:val="center"/>
+          </w:tcPr>
+          <w:p>
+            <w:pPr>
+              <w:jc w:val="left"/>
+            </w:pPr>
+            <w:r>
+              <w:rPr>
+                <w:b w:val="0"/>
+                <w:sz w:val="16"/>
+              </w:rPr>
+              <w:t>A-06 (back) · A-07c (M9 cancel state)</w:t>
             </w:r>
           </w:p>
         </w:tc>
         <w:tc>
           <w:tcPr>
             <w:tcW w:type="dxa" w:w="1984"/>
-            <w:shd w:val="clear" w:color="auto" w:fill="E8F0F8"/>
-            <w:vAlign w:val="center"/>
-          </w:tcPr>
-          <w:p>
-            <w:pPr>
-              <w:jc w:val="left"/>
-            </w:pPr>
-            <w:r>
-              <w:rPr>
-                <w:b w:val="0"/>
-                <w:sz w:val="16"/>
-              </w:rPr>
-              <w:t>WeeeU: U-16 ดูงาน · WeeeR: R-14 ดูงาน · WeeeT: T-11 ดูงาน</w:t>
+            <w:shd w:val="clear" w:color="auto" w:fill="FFFFFF"/>
+            <w:vAlign w:val="center"/>
+          </w:tcPr>
+          <w:p>
+            <w:pPr>
+              <w:jc w:val="left"/>
+            </w:pPr>
+            <w:r>
+              <w:rPr>
+                <w:b w:val="0"/>
+                <w:sz w:val="16"/>
+              </w:rPr>
+              <w:t>WeeeU: U-16 ดูงาน · WeeeR: R-14 ดูงาน · WeeeT: T-08/T-09</w:t>
             </w:r>
           </w:p>
         </w:tc>
         <w:tc>
           <w:tcPr>
             <w:tcW w:type="dxa" w:w="1134"/>
-            <w:shd w:val="clear" w:color="auto" w:fill="E8F0F8"/>
+            <w:shd w:val="clear" w:color="auto" w:fill="FFFFFF"/>
             <w:vAlign w:val="center"/>
           </w:tcPr>
           <w:p>
@@ -1410,38 +1410,38 @@
         <w:tc>
           <w:tcPr>
             <w:tcW w:type="dxa" w:w="2551"/>
-            <w:shd w:val="clear" w:color="auto" w:fill="E8F0F8"/>
-            <w:vAlign w:val="center"/>
-          </w:tcPr>
-          <w:p>
-            <w:pPr>
-              <w:jc w:val="left"/>
-            </w:pPr>
-            <w:r>
-              <w:rPr>
-                <w:b w:val="0"/>
-                <w:sz w:val="16"/>
-              </w:rPr>
-              <w:t>sample: 12 งาน active · สถานะ: scheduled/in_progress/completed</w:t>
+            <w:shd w:val="clear" w:color="auto" w:fill="FFFFFF"/>
+            <w:vAlign w:val="center"/>
+          </w:tcPr>
+          <w:p>
+            <w:pPr>
+              <w:jc w:val="left"/>
+            </w:pPr>
+            <w:r>
+              <w:rPr>
+                <w:b w:val="0"/>
+                <w:sz w:val="16"/>
+              </w:rPr>
+              <w:t>sample: MAINT-2024-005 · WeeeU: สมหญิง ข. · บ้านเลขที่ 55 · สัญญา 6 เดือน</w:t>
             </w:r>
           </w:p>
         </w:tc>
         <w:tc>
           <w:tcPr>
             <w:tcW w:type="dxa" w:w="2268"/>
-            <w:shd w:val="clear" w:color="auto" w:fill="E8F0F8"/>
-            <w:vAlign w:val="center"/>
-          </w:tcPr>
-          <w:p>
-            <w:pPr>
-              <w:jc w:val="left"/>
-            </w:pPr>
-            <w:r>
-              <w:rPr>
-                <w:b w:val="0"/>
-                <w:sz w:val="16"/>
-              </w:rPr>
-              <w:t>http://localhost:3000/maintain/jobs</w:t>
+            <w:shd w:val="clear" w:color="auto" w:fill="FFFFFF"/>
+            <w:vAlign w:val="center"/>
+          </w:tcPr>
+          <w:p>
+            <w:pPr>
+              <w:jc w:val="left"/>
+            </w:pPr>
+            <w:r>
+              <w:rPr>
+                <w:b w:val="0"/>
+                <w:sz w:val="16"/>
+              </w:rPr>
+              <w:t>http://localhost:3000/maintain/jobs/m001</w:t>
             </w:r>
           </w:p>
         </w:tc>
@@ -1463,7 +1463,7 @@
                 <w:color w:val="2C5E8C"/>
                 <w:sz w:val="17"/>
               </w:rPr>
-              <w:t>A-07</w:t>
+              <w:t>A-08</w:t>
             </w:r>
           </w:p>
         </w:tc>
@@ -1482,7 +1482,7 @@
                 <w:b w:val="0"/>
                 <w:sz w:val="16"/>
               </w:rPr>
-              <w:t>Maintain Job Detail — รายละเอียดงานบำรุง timeline</w:t>
+              <w:t>Scrap Jobs — รายการงานซากทั้งระบบ</w:t>
             </w:r>
           </w:p>
         </w:tc>
@@ -1501,7 +1501,7 @@
                 <w:b w:val="0"/>
                 <w:sz w:val="16"/>
               </w:rPr>
-              <w:t>A-06 (list)</w:t>
+              <w:t>A-01 (sidebar) · A-08b (back)</w:t>
             </w:r>
           </w:p>
         </w:tc>
@@ -1520,7 +1520,7 @@
                 <w:b w:val="0"/>
                 <w:sz w:val="16"/>
               </w:rPr>
-              <w:t>คลิกรายการงานบำรุง</w:t>
+              <w:t>Admin ดูงานซาก S1-S12 | variant: [A-08b] Scrap Job Detail — รายละเอียดงานซาก · เงื่อนไข: คลิกรายการงานซาก · เคส: S1-S12 · หมายเหตุ: sample: SCRAP-2024-003 · น้ำหนัก 15 กก. · ราคาซาก 450 บาท</w:t>
             </w:r>
           </w:p>
         </w:tc>
@@ -1539,7 +1539,7 @@
                 <w:b w:val="0"/>
                 <w:sz w:val="16"/>
               </w:rPr>
-              <w:t>A-06 (back) · A-07c (M9 cancel state)</w:t>
+              <w:t>A-08b Job Detail · A-09 Disputes</w:t>
             </w:r>
           </w:p>
         </w:tc>
@@ -1558,7 +1558,7 @@
                 <w:b w:val="0"/>
                 <w:sz w:val="16"/>
               </w:rPr>
-              <w:t>WeeeU: U-16 ดูงาน · WeeeR: R-14 ดูงาน · WeeeT: T-08/T-09</w:t>
+              <w:t>WeeeU: U-33 ดูสถานะ · WeeeR: R-27/R-28 ดูงาน · WeeeT: T-04 รับขนส่ง</w:t>
             </w:r>
           </w:p>
         </w:tc>
@@ -1577,7 +1577,7 @@
                 <w:b w:val="0"/>
                 <w:sz w:val="16"/>
               </w:rPr>
-              <w:t>M1-M9</w:t>
+              <w:t>S1-S12</w:t>
             </w:r>
           </w:p>
         </w:tc>
@@ -1596,7 +1596,7 @@
                 <w:b w:val="0"/>
                 <w:sz w:val="16"/>
               </w:rPr>
-              <w:t>sample: MAINT-2024-005 · WeeeU: สมหญิง ข. · บ้านเลขที่ 55 · สัญญา 6 เดือน</w:t>
+              <w:t>sample: 8 งาน · S4: ออกใบรับรอง · S6/S9: รับซาก</w:t>
             </w:r>
           </w:p>
         </w:tc>
@@ -1615,529 +1615,7 @@
                 <w:b w:val="0"/>
                 <w:sz w:val="16"/>
               </w:rPr>
-              <w:t>http://localhost:3000/maintain/jobs/m001</w:t>
-            </w:r>
-          </w:p>
-        </w:tc>
-      </w:tr>
-      <w:tr>
-        <w:tc>
-          <w:tcPr>
-            <w:tcW w:type="dxa" w:w="850"/>
-            <w:shd w:val="clear" w:color="auto" w:fill="E8F0F8"/>
-            <w:vAlign w:val="center"/>
-          </w:tcPr>
-          <w:p>
-            <w:pPr>
-              <w:jc w:val="left"/>
-            </w:pPr>
-            <w:r>
-              <w:rPr>
-                <w:b/>
-                <w:color w:val="2C5E8C"/>
-                <w:sz w:val="17"/>
-              </w:rPr>
-              <w:t>A-07c</w:t>
-            </w:r>
-          </w:p>
-        </w:tc>
-        <w:tc>
-          <w:tcPr>
-            <w:tcW w:type="dxa" w:w="2551"/>
-            <w:shd w:val="clear" w:color="auto" w:fill="E8F0F8"/>
-            <w:vAlign w:val="center"/>
-          </w:tcPr>
-          <w:p>
-            <w:pPr>
-              <w:jc w:val="left"/>
-            </w:pPr>
-            <w:r>
-              <w:rPr>
-                <w:b w:val="0"/>
-                <w:sz w:val="16"/>
-              </w:rPr>
-              <w:t>Maintain Job M9-Cancelled — mockup state ยกเลิก M9</w:t>
-            </w:r>
-          </w:p>
-        </w:tc>
-        <w:tc>
-          <w:tcPr>
-            <w:tcW w:type="dxa" w:w="1984"/>
-            <w:shd w:val="clear" w:color="auto" w:fill="E8F0F8"/>
-            <w:vAlign w:val="center"/>
-          </w:tcPr>
-          <w:p>
-            <w:pPr>
-              <w:jc w:val="left"/>
-            </w:pPr>
-            <w:r>
-              <w:rPr>
-                <w:b w:val="0"/>
-                <w:sz w:val="16"/>
-              </w:rPr>
-              <w:t>A-07 (Job Detail)</w:t>
-            </w:r>
-          </w:p>
-        </w:tc>
-        <w:tc>
-          <w:tcPr>
-            <w:tcW w:type="dxa" w:w="1984"/>
-            <w:shd w:val="clear" w:color="auto" w:fill="E8F0F8"/>
-            <w:vAlign w:val="center"/>
-          </w:tcPr>
-          <w:p>
-            <w:pPr>
-              <w:jc w:val="left"/>
-            </w:pPr>
-            <w:r>
-              <w:rPr>
-                <w:b w:val="0"/>
-                <w:sz w:val="16"/>
-              </w:rPr>
-              <w:t>สถานะ M9 (ยกเลิก)</w:t>
-            </w:r>
-          </w:p>
-        </w:tc>
-        <w:tc>
-          <w:tcPr>
-            <w:tcW w:type="dxa" w:w="1984"/>
-            <w:shd w:val="clear" w:color="auto" w:fill="E8F0F8"/>
-            <w:vAlign w:val="center"/>
-          </w:tcPr>
-          <w:p>
-            <w:pPr>
-              <w:jc w:val="left"/>
-            </w:pPr>
-            <w:r>
-              <w:rPr>
-                <w:b w:val="0"/>
-                <w:sz w:val="16"/>
-              </w:rPr>
-              <w:t>A-07 (back)</w:t>
-            </w:r>
-          </w:p>
-        </w:tc>
-        <w:tc>
-          <w:tcPr>
-            <w:tcW w:type="dxa" w:w="1984"/>
-            <w:shd w:val="clear" w:color="auto" w:fill="E8F0F8"/>
-            <w:vAlign w:val="center"/>
-          </w:tcPr>
-          <w:p>
-            <w:pPr>
-              <w:jc w:val="left"/>
-            </w:pPr>
-            <w:r>
-              <w:rPr>
-                <w:b w:val="0"/>
-                <w:sz w:val="16"/>
-              </w:rPr>
-              <w:t>—</w:t>
-            </w:r>
-          </w:p>
-        </w:tc>
-        <w:tc>
-          <w:tcPr>
-            <w:tcW w:type="dxa" w:w="1134"/>
-            <w:shd w:val="clear" w:color="auto" w:fill="E8F0F8"/>
-            <w:vAlign w:val="center"/>
-          </w:tcPr>
-          <w:p>
-            <w:pPr>
-              <w:jc w:val="left"/>
-            </w:pPr>
-            <w:r>
-              <w:rPr>
-                <w:b w:val="0"/>
-                <w:sz w:val="16"/>
-              </w:rPr>
-              <w:t>M9</w:t>
-            </w:r>
-          </w:p>
-        </w:tc>
-        <w:tc>
-          <w:tcPr>
-            <w:tcW w:type="dxa" w:w="2551"/>
-            <w:shd w:val="clear" w:color="auto" w:fill="E8F0F8"/>
-            <w:vAlign w:val="center"/>
-          </w:tcPr>
-          <w:p>
-            <w:pPr>
-              <w:jc w:val="left"/>
-            </w:pPr>
-            <w:r>
-              <w:rPr>
-                <w:b w:val="0"/>
-                <w:sz w:val="16"/>
-              </w:rPr>
-              <w:t>mockup แสดงสถานะ cancelled · พอยต์ทองที่ล็อกคืน WeeeU</w:t>
-            </w:r>
-          </w:p>
-        </w:tc>
-        <w:tc>
-          <w:tcPr>
-            <w:tcW w:type="dxa" w:w="2268"/>
-            <w:shd w:val="clear" w:color="auto" w:fill="E8F0F8"/>
-            <w:vAlign w:val="center"/>
-          </w:tcPr>
-          <w:p>
-            <w:pPr>
-              <w:jc w:val="left"/>
-            </w:pPr>
-            <w:r>
-              <w:rPr>
-                <w:b w:val="0"/>
-                <w:sz w:val="16"/>
-              </w:rPr>
-              <w:t>http://localhost:3000/maintain/jobs/m001/mockup/m9-cancelled</w:t>
-            </w:r>
-          </w:p>
-        </w:tc>
-      </w:tr>
-      <w:tr>
-        <w:tc>
-          <w:tcPr>
-            <w:tcW w:type="dxa" w:w="850"/>
-            <w:shd w:val="clear" w:color="auto" w:fill="FFFFFF"/>
-            <w:vAlign w:val="center"/>
-          </w:tcPr>
-          <w:p>
-            <w:pPr>
-              <w:jc w:val="left"/>
-            </w:pPr>
-            <w:r>
-              <w:rPr>
-                <w:b/>
-                <w:color w:val="2C5E8C"/>
-                <w:sz w:val="17"/>
-              </w:rPr>
-              <w:t>A-08</w:t>
-            </w:r>
-          </w:p>
-        </w:tc>
-        <w:tc>
-          <w:tcPr>
-            <w:tcW w:type="dxa" w:w="2551"/>
-            <w:shd w:val="clear" w:color="auto" w:fill="FFFFFF"/>
-            <w:vAlign w:val="center"/>
-          </w:tcPr>
-          <w:p>
-            <w:pPr>
-              <w:jc w:val="left"/>
-            </w:pPr>
-            <w:r>
-              <w:rPr>
-                <w:b w:val="0"/>
-                <w:sz w:val="16"/>
-              </w:rPr>
-              <w:t>Scrap Jobs — รายการงานซากทั้งระบบ</w:t>
-            </w:r>
-          </w:p>
-        </w:tc>
-        <w:tc>
-          <w:tcPr>
-            <w:tcW w:type="dxa" w:w="1984"/>
-            <w:shd w:val="clear" w:color="auto" w:fill="FFFFFF"/>
-            <w:vAlign w:val="center"/>
-          </w:tcPr>
-          <w:p>
-            <w:pPr>
-              <w:jc w:val="left"/>
-            </w:pPr>
-            <w:r>
-              <w:rPr>
-                <w:b w:val="0"/>
-                <w:sz w:val="16"/>
-              </w:rPr>
-              <w:t>A-01 (sidebar) · A-08b (back)</w:t>
-            </w:r>
-          </w:p>
-        </w:tc>
-        <w:tc>
-          <w:tcPr>
-            <w:tcW w:type="dxa" w:w="1984"/>
-            <w:shd w:val="clear" w:color="auto" w:fill="FFFFFF"/>
-            <w:vAlign w:val="center"/>
-          </w:tcPr>
-          <w:p>
-            <w:pPr>
-              <w:jc w:val="left"/>
-            </w:pPr>
-            <w:r>
-              <w:rPr>
-                <w:b w:val="0"/>
-                <w:sz w:val="16"/>
-              </w:rPr>
-              <w:t>Admin ดูงานซาก S1-S12</w:t>
-            </w:r>
-          </w:p>
-        </w:tc>
-        <w:tc>
-          <w:tcPr>
-            <w:tcW w:type="dxa" w:w="1984"/>
-            <w:shd w:val="clear" w:color="auto" w:fill="FFFFFF"/>
-            <w:vAlign w:val="center"/>
-          </w:tcPr>
-          <w:p>
-            <w:pPr>
-              <w:jc w:val="left"/>
-            </w:pPr>
-            <w:r>
-              <w:rPr>
-                <w:b w:val="0"/>
-                <w:sz w:val="16"/>
-              </w:rPr>
-              <w:t>A-08b Job Detail · A-09 Disputes</w:t>
-            </w:r>
-          </w:p>
-        </w:tc>
-        <w:tc>
-          <w:tcPr>
-            <w:tcW w:type="dxa" w:w="1984"/>
-            <w:shd w:val="clear" w:color="auto" w:fill="FFFFFF"/>
-            <w:vAlign w:val="center"/>
-          </w:tcPr>
-          <w:p>
-            <w:pPr>
-              <w:jc w:val="left"/>
-            </w:pPr>
-            <w:r>
-              <w:rPr>
-                <w:b w:val="0"/>
-                <w:sz w:val="16"/>
-              </w:rPr>
-              <w:t>WeeeU: U-33 ดูสถานะ · WeeeR: R-27/R-28 ดูงาน · WeeeT: T-04 รับขนส่ง</w:t>
-            </w:r>
-          </w:p>
-        </w:tc>
-        <w:tc>
-          <w:tcPr>
-            <w:tcW w:type="dxa" w:w="1134"/>
-            <w:shd w:val="clear" w:color="auto" w:fill="FFFFFF"/>
-            <w:vAlign w:val="center"/>
-          </w:tcPr>
-          <w:p>
-            <w:pPr>
-              <w:jc w:val="left"/>
-            </w:pPr>
-            <w:r>
-              <w:rPr>
-                <w:b w:val="0"/>
-                <w:sz w:val="16"/>
-              </w:rPr>
-              <w:t>S1-S12</w:t>
-            </w:r>
-          </w:p>
-        </w:tc>
-        <w:tc>
-          <w:tcPr>
-            <w:tcW w:type="dxa" w:w="2551"/>
-            <w:shd w:val="clear" w:color="auto" w:fill="FFFFFF"/>
-            <w:vAlign w:val="center"/>
-          </w:tcPr>
-          <w:p>
-            <w:pPr>
-              <w:jc w:val="left"/>
-            </w:pPr>
-            <w:r>
-              <w:rPr>
-                <w:b w:val="0"/>
-                <w:sz w:val="16"/>
-              </w:rPr>
-              <w:t>sample: 8 งาน · S4: ออกใบรับรอง · S6/S9: รับซาก</w:t>
-            </w:r>
-          </w:p>
-        </w:tc>
-        <w:tc>
-          <w:tcPr>
-            <w:tcW w:type="dxa" w:w="2268"/>
-            <w:shd w:val="clear" w:color="auto" w:fill="FFFFFF"/>
-            <w:vAlign w:val="center"/>
-          </w:tcPr>
-          <w:p>
-            <w:pPr>
-              <w:jc w:val="left"/>
-            </w:pPr>
-            <w:r>
-              <w:rPr>
-                <w:b w:val="0"/>
-                <w:sz w:val="16"/>
-              </w:rPr>
               <w:t>http://localhost:3000/scrap/jobs</w:t>
-            </w:r>
-          </w:p>
-        </w:tc>
-      </w:tr>
-      <w:tr>
-        <w:tc>
-          <w:tcPr>
-            <w:tcW w:type="dxa" w:w="850"/>
-            <w:shd w:val="clear" w:color="auto" w:fill="E8F0F8"/>
-            <w:vAlign w:val="center"/>
-          </w:tcPr>
-          <w:p>
-            <w:pPr>
-              <w:jc w:val="left"/>
-            </w:pPr>
-            <w:r>
-              <w:rPr>
-                <w:b/>
-                <w:color w:val="2C5E8C"/>
-                <w:sz w:val="17"/>
-              </w:rPr>
-              <w:t>A-08b</w:t>
-            </w:r>
-          </w:p>
-        </w:tc>
-        <w:tc>
-          <w:tcPr>
-            <w:tcW w:type="dxa" w:w="2551"/>
-            <w:shd w:val="clear" w:color="auto" w:fill="E8F0F8"/>
-            <w:vAlign w:val="center"/>
-          </w:tcPr>
-          <w:p>
-            <w:pPr>
-              <w:jc w:val="left"/>
-            </w:pPr>
-            <w:r>
-              <w:rPr>
-                <w:b w:val="0"/>
-                <w:sz w:val="16"/>
-              </w:rPr>
-              <w:t>Scrap Job Detail — รายละเอียดงานซาก</w:t>
-            </w:r>
-          </w:p>
-        </w:tc>
-        <w:tc>
-          <w:tcPr>
-            <w:tcW w:type="dxa" w:w="1984"/>
-            <w:shd w:val="clear" w:color="auto" w:fill="E8F0F8"/>
-            <w:vAlign w:val="center"/>
-          </w:tcPr>
-          <w:p>
-            <w:pPr>
-              <w:jc w:val="left"/>
-            </w:pPr>
-            <w:r>
-              <w:rPr>
-                <w:b w:val="0"/>
-                <w:sz w:val="16"/>
-              </w:rPr>
-              <w:t>A-08 (list)</w:t>
-            </w:r>
-          </w:p>
-        </w:tc>
-        <w:tc>
-          <w:tcPr>
-            <w:tcW w:type="dxa" w:w="1984"/>
-            <w:shd w:val="clear" w:color="auto" w:fill="E8F0F8"/>
-            <w:vAlign w:val="center"/>
-          </w:tcPr>
-          <w:p>
-            <w:pPr>
-              <w:jc w:val="left"/>
-            </w:pPr>
-            <w:r>
-              <w:rPr>
-                <w:b w:val="0"/>
-                <w:sz w:val="16"/>
-              </w:rPr>
-              <w:t>คลิกรายการงานซาก</w:t>
-            </w:r>
-          </w:p>
-        </w:tc>
-        <w:tc>
-          <w:tcPr>
-            <w:tcW w:type="dxa" w:w="1984"/>
-            <w:shd w:val="clear" w:color="auto" w:fill="E8F0F8"/>
-            <w:vAlign w:val="center"/>
-          </w:tcPr>
-          <w:p>
-            <w:pPr>
-              <w:jc w:val="left"/>
-            </w:pPr>
-            <w:r>
-              <w:rPr>
-                <w:b w:val="0"/>
-                <w:sz w:val="16"/>
-              </w:rPr>
-              <w:t>A-08 (back)</w:t>
-            </w:r>
-          </w:p>
-        </w:tc>
-        <w:tc>
-          <w:tcPr>
-            <w:tcW w:type="dxa" w:w="1984"/>
-            <w:shd w:val="clear" w:color="auto" w:fill="E8F0F8"/>
-            <w:vAlign w:val="center"/>
-          </w:tcPr>
-          <w:p>
-            <w:pPr>
-              <w:jc w:val="left"/>
-            </w:pPr>
-            <w:r>
-              <w:rPr>
-                <w:b w:val="0"/>
-                <w:sz w:val="16"/>
-              </w:rPr>
-              <w:t>WeeeU: U-33 · WeeeR: R-28</w:t>
-            </w:r>
-          </w:p>
-        </w:tc>
-        <w:tc>
-          <w:tcPr>
-            <w:tcW w:type="dxa" w:w="1134"/>
-            <w:shd w:val="clear" w:color="auto" w:fill="E8F0F8"/>
-            <w:vAlign w:val="center"/>
-          </w:tcPr>
-          <w:p>
-            <w:pPr>
-              <w:jc w:val="left"/>
-            </w:pPr>
-            <w:r>
-              <w:rPr>
-                <w:b w:val="0"/>
-                <w:sz w:val="16"/>
-              </w:rPr>
-              <w:t>S1-S12</w:t>
-            </w:r>
-          </w:p>
-        </w:tc>
-        <w:tc>
-          <w:tcPr>
-            <w:tcW w:type="dxa" w:w="2551"/>
-            <w:shd w:val="clear" w:color="auto" w:fill="E8F0F8"/>
-            <w:vAlign w:val="center"/>
-          </w:tcPr>
-          <w:p>
-            <w:pPr>
-              <w:jc w:val="left"/>
-            </w:pPr>
-            <w:r>
-              <w:rPr>
-                <w:b w:val="0"/>
-                <w:sz w:val="16"/>
-              </w:rPr>
-              <w:t>sample: SCRAP-2024-003 · น้ำหนัก 15 กก. · ราคาซาก 450 บาท</w:t>
-            </w:r>
-          </w:p>
-        </w:tc>
-        <w:tc>
-          <w:tcPr>
-            <w:tcW w:type="dxa" w:w="2268"/>
-            <w:shd w:val="clear" w:color="auto" w:fill="E8F0F8"/>
-            <w:vAlign w:val="center"/>
-          </w:tcPr>
-          <w:p>
-            <w:pPr>
-              <w:jc w:val="left"/>
-            </w:pPr>
-            <w:r>
-              <w:rPr>
-                <w:b w:val="0"/>
-                <w:sz w:val="16"/>
-              </w:rPr>
-              <w:t>http://localhost:3000/scrap/jobs/s001</w:t>
             </w:r>
           </w:p>
         </w:tc>

</xml_diff>

<commit_message>
P4-FINALIZE T5: fix A-07c xapp + qualify nav targets (Advisor Ruling R1)
mock-anno-data.ts: A-07c xapp empty -> fill WeeeU(U-16)/WeeeR(R-14)/WeeeT(T-11)
mock-anno-data.ts: qualify variant targetLabels in A-03/A-07/A-08 base entries
Admin_Screens.docx: qualify bare nav in col-maajak + col-bptor (4 cells)
build: 1 successful | jest: 200/200

Co-Authored-By: Claude Sonnet 4.6 <noreply@anthropic.com>
</commit_message>
<xml_diff>
--- a/docs/Admin_Screens.docx
+++ b/docs/Admin_Screens.docx
@@ -669,7 +669,7 @@
                 <w:b w:val="0"/>
                 <w:sz w:val="16"/>
               </w:rPr>
-              <w:t>A-02 (back) · A-05 Dispute (C9) · A-03c Manual Override</w:t>
+              <w:t>A-02 (back) · A-05 Dispute (C9) · A-03 (state-c) Manual Override</w:t>
             </w:r>
           </w:p>
         </w:tc>
@@ -1365,7 +1365,7 @@
                 <w:b w:val="0"/>
                 <w:sz w:val="16"/>
               </w:rPr>
-              <w:t>A-06 (back) · A-07c (M9 cancel state)</w:t>
+              <w:t>A-06 (back) · A-07 (state-c) (M9 cancel state)</w:t>
             </w:r>
           </w:p>
         </w:tc>
@@ -1501,7 +1501,7 @@
                 <w:b w:val="0"/>
                 <w:sz w:val="16"/>
               </w:rPr>
-              <w:t>A-01 (sidebar) · A-08b (back)</w:t>
+              <w:t>A-01 (sidebar) · A-08 (state-b) (back)</w:t>
             </w:r>
           </w:p>
         </w:tc>
@@ -1539,7 +1539,7 @@
                 <w:b w:val="0"/>
                 <w:sz w:val="16"/>
               </w:rPr>
-              <w:t>A-08b Job Detail · A-09 Disputes</w:t>
+              <w:t>A-08 (state-b) Job Detail · A-09 Disputes</w:t>
             </w:r>
           </w:p>
         </w:tc>

</xml_diff>

<commit_message>
feat(admin): treefix — add A-03c/A-07c/A-08b variant rows to Admin_Screens.docx + D-Resell-1 MockAnno cleanup
Task 1-A: Admin_Screens.docx — insert 3 variant rows (pale-yellow FFF9C4) after parent rows:
  · A-03c Repair Job Manual Override
  · A-07c Maintain Job M9-Cancelled mockup
  · A-08b Scrap Job Detail
Task 1-B: resell/fees page.tsx — remove D-Resell-1 from h1 + h2 headings
Task 1-B: junction-data.ts — add A-36 → /resell/fees to ROUTE_MAP
Task 1-B: mock-anno-data.ts — add D-Resell-1 dref to A-36 MockAnno entry
Verified: jest 200/200 PASS · build PASS

Co-Authored-By: Claude Sonnet 4.6 <noreply@anthropic.com>
</commit_message>
<xml_diff>
--- a/docs/Admin_Screens.docx
+++ b/docs/Admin_Screens.docx
@@ -754,7 +754,7 @@
         <w:tc>
           <w:tcPr>
             <w:tcW w:type="dxa" w:w="850"/>
-            <w:shd w:val="clear" w:color="auto" w:fill="E8F0F8"/>
+            <w:shd w:val="clear" w:color="auto" w:fill="FFF9C4"/>
             <w:vAlign w:val="center"/>
           </w:tcPr>
           <w:p>
@@ -767,159 +767,159 @@
                 <w:color w:val="2C5E8C"/>
                 <w:sz w:val="17"/>
               </w:rPr>
-              <w:t>A-04</w:t>
+              <w:t>A-03c</w:t>
             </w:r>
           </w:p>
         </w:tc>
         <w:tc>
           <w:tcPr>
             <w:tcW w:type="dxa" w:w="2551"/>
-            <w:shd w:val="clear" w:color="auto" w:fill="E8F0F8"/>
-            <w:vAlign w:val="center"/>
-          </w:tcPr>
-          <w:p>
-            <w:pPr>
-              <w:jc w:val="left"/>
-            </w:pPr>
-            <w:r>
-              <w:rPr>
-                <w:b w:val="0"/>
-                <w:sz w:val="16"/>
-              </w:rPr>
-              <w:t>Repair Disputes — รายการข้อพิพาทงานซ่อม</w:t>
+            <w:shd w:val="clear" w:color="auto" w:fill="FFF9C4"/>
+            <w:vAlign w:val="center"/>
+          </w:tcPr>
+          <w:p>
+            <w:pPr>
+              <w:jc w:val="left"/>
+            </w:pPr>
+            <w:r>
+              <w:rPr>
+                <w:b w:val="0"/>
+                <w:sz w:val="16"/>
+              </w:rPr>
+              <w:t>Repair Job Manual Override — Admin บังคับเปลี่ยนสถานะ</w:t>
             </w:r>
           </w:p>
         </w:tc>
         <w:tc>
           <w:tcPr>
             <w:tcW w:type="dxa" w:w="1984"/>
-            <w:shd w:val="clear" w:color="auto" w:fill="E8F0F8"/>
-            <w:vAlign w:val="center"/>
-          </w:tcPr>
-          <w:p>
-            <w:pPr>
-              <w:jc w:val="left"/>
-            </w:pPr>
-            <w:r>
-              <w:rPr>
-                <w:b w:val="0"/>
-                <w:sz w:val="16"/>
-              </w:rPr>
-              <w:t>A-01 (sidebar) · A-02 (tab)</w:t>
+            <w:shd w:val="clear" w:color="auto" w:fill="FFF9C4"/>
+            <w:vAlign w:val="center"/>
+          </w:tcPr>
+          <w:p>
+            <w:pPr>
+              <w:jc w:val="left"/>
+            </w:pPr>
+            <w:r>
+              <w:rPr>
+                <w:b w:val="0"/>
+                <w:sz w:val="16"/>
+              </w:rPr>
+              <w:t>A-03 (parent — post-dispute)</w:t>
             </w:r>
           </w:p>
         </w:tc>
         <w:tc>
           <w:tcPr>
             <w:tcW w:type="dxa" w:w="1984"/>
-            <w:shd w:val="clear" w:color="auto" w:fill="E8F0F8"/>
-            <w:vAlign w:val="center"/>
-          </w:tcPr>
-          <w:p>
-            <w:pPr>
-              <w:jc w:val="left"/>
-            </w:pPr>
-            <w:r>
-              <w:rPr>
-                <w:b w:val="0"/>
-                <w:sz w:val="16"/>
-              </w:rPr>
-              <w:t>มีข้อพิพาท C9</w:t>
+            <w:shd w:val="clear" w:color="auto" w:fill="FFF9C4"/>
+            <w:vAlign w:val="center"/>
+          </w:tcPr>
+          <w:p>
+            <w:pPr>
+              <w:jc w:val="left"/>
+            </w:pPr>
+            <w:r>
+              <w:rPr>
+                <w:b w:val="0"/>
+                <w:sz w:val="16"/>
+              </w:rPr>
+              <w:t>Admin override สถานะงานซ่อม หลัง C9 ตัดสิน · บันทึก audit log</w:t>
             </w:r>
           </w:p>
         </w:tc>
         <w:tc>
           <w:tcPr>
             <w:tcW w:type="dxa" w:w="1984"/>
-            <w:shd w:val="clear" w:color="auto" w:fill="E8F0F8"/>
-            <w:vAlign w:val="center"/>
-          </w:tcPr>
-          <w:p>
-            <w:pPr>
-              <w:jc w:val="left"/>
-            </w:pPr>
-            <w:r>
-              <w:rPr>
-                <w:b w:val="0"/>
-                <w:sz w:val="16"/>
-              </w:rPr>
-              <w:t>A-05 Dispute Detail</w:t>
+            <w:shd w:val="clear" w:color="auto" w:fill="FFF9C4"/>
+            <w:vAlign w:val="center"/>
+          </w:tcPr>
+          <w:p>
+            <w:pPr>
+              <w:jc w:val="left"/>
+            </w:pPr>
+            <w:r>
+              <w:rPr>
+                <w:b w:val="0"/>
+                <w:sz w:val="16"/>
+              </w:rPr>
+              <w:t>A-03 (back after override)</w:t>
             </w:r>
           </w:p>
         </w:tc>
         <w:tc>
           <w:tcPr>
             <w:tcW w:type="dxa" w:w="1984"/>
-            <w:shd w:val="clear" w:color="auto" w:fill="E8F0F8"/>
-            <w:vAlign w:val="center"/>
-          </w:tcPr>
-          <w:p>
-            <w:pPr>
-              <w:jc w:val="left"/>
-            </w:pPr>
-            <w:r>
-              <w:rPr>
-                <w:b w:val="0"/>
-                <w:sz w:val="16"/>
-              </w:rPr>
-              <w:t>WeeeU: U-04 เห็นสถานะ dispute · WeeeR: R-11 เห็นสถานะ C9</w:t>
+            <w:shd w:val="clear" w:color="auto" w:fill="FFF9C4"/>
+            <w:vAlign w:val="center"/>
+          </w:tcPr>
+          <w:p>
+            <w:pPr>
+              <w:jc w:val="left"/>
+            </w:pPr>
+            <w:r>
+              <w:rPr>
+                <w:b w:val="0"/>
+                <w:sz w:val="16"/>
+              </w:rPr>
+              <w:t>—</w:t>
             </w:r>
           </w:p>
         </w:tc>
         <w:tc>
           <w:tcPr>
             <w:tcW w:type="dxa" w:w="1134"/>
-            <w:shd w:val="clear" w:color="auto" w:fill="E8F0F8"/>
-            <w:vAlign w:val="center"/>
-          </w:tcPr>
-          <w:p>
-            <w:pPr>
-              <w:jc w:val="left"/>
-            </w:pPr>
-            <w:r>
-              <w:rPr>
-                <w:b w:val="0"/>
-                <w:sz w:val="16"/>
-              </w:rPr>
-              <w:t>C9</w:t>
+            <w:shd w:val="clear" w:color="auto" w:fill="FFF9C4"/>
+            <w:vAlign w:val="center"/>
+          </w:tcPr>
+          <w:p>
+            <w:pPr>
+              <w:jc w:val="left"/>
+            </w:pPr>
+            <w:r>
+              <w:rPr>
+                <w:b w:val="0"/>
+                <w:sz w:val="16"/>
+              </w:rPr>
+              <w:t>C1-C10</w:t>
             </w:r>
           </w:p>
         </w:tc>
         <w:tc>
           <w:tcPr>
             <w:tcW w:type="dxa" w:w="2551"/>
-            <w:shd w:val="clear" w:color="auto" w:fill="E8F0F8"/>
-            <w:vAlign w:val="center"/>
-          </w:tcPr>
-          <w:p>
-            <w:pPr>
-              <w:jc w:val="left"/>
-            </w:pPr>
-            <w:r>
-              <w:rPr>
-                <w:b w:val="0"/>
-                <w:sz w:val="16"/>
-              </w:rPr>
-              <w:t>sample: 2 รายการ pending · dispute reason: "งานไม่เป็นไปตามราคา"</w:t>
+            <w:shd w:val="clear" w:color="auto" w:fill="FFF9C4"/>
+            <w:vAlign w:val="center"/>
+          </w:tcPr>
+          <w:p>
+            <w:pPr>
+              <w:jc w:val="left"/>
+            </w:pPr>
+            <w:r>
+              <w:rPr>
+                <w:b w:val="0"/>
+                <w:sz w:val="16"/>
+              </w:rPr>
+              <w:t>sample: JOB-2024-001 · override → completed</w:t>
             </w:r>
           </w:p>
         </w:tc>
         <w:tc>
           <w:tcPr>
             <w:tcW w:type="dxa" w:w="2268"/>
-            <w:shd w:val="clear" w:color="auto" w:fill="E8F0F8"/>
-            <w:vAlign w:val="center"/>
-          </w:tcPr>
-          <w:p>
-            <w:pPr>
-              <w:jc w:val="left"/>
-            </w:pPr>
-            <w:r>
-              <w:rPr>
-                <w:b w:val="0"/>
-                <w:sz w:val="16"/>
-              </w:rPr>
-              <w:t>http://localhost:3000/repair/disputes</w:t>
+            <w:shd w:val="clear" w:color="auto" w:fill="FFF9C4"/>
+            <w:vAlign w:val="center"/>
+          </w:tcPr>
+          <w:p>
+            <w:pPr>
+              <w:jc w:val="left"/>
+            </w:pPr>
+            <w:r>
+              <w:rPr>
+                <w:b w:val="0"/>
+                <w:sz w:val="16"/>
+              </w:rPr>
+              <w:t>http://localhost:3000/repair/jobs/c001/manual-override</w:t>
             </w:r>
           </w:p>
         </w:tc>
@@ -928,7 +928,7 @@
         <w:tc>
           <w:tcPr>
             <w:tcW w:type="dxa" w:w="850"/>
-            <w:shd w:val="clear" w:color="auto" w:fill="FFFFFF"/>
+            <w:shd w:val="clear" w:color="auto" w:fill="E8F0F8"/>
             <w:vAlign w:val="center"/>
           </w:tcPr>
           <w:p>
@@ -941,109 +941,109 @@
                 <w:color w:val="2C5E8C"/>
                 <w:sz w:val="17"/>
               </w:rPr>
-              <w:t>A-05</w:t>
+              <w:t>A-04</w:t>
             </w:r>
           </w:p>
         </w:tc>
         <w:tc>
           <w:tcPr>
             <w:tcW w:type="dxa" w:w="2551"/>
-            <w:shd w:val="clear" w:color="auto" w:fill="FFFFFF"/>
-            <w:vAlign w:val="center"/>
-          </w:tcPr>
-          <w:p>
-            <w:pPr>
-              <w:jc w:val="left"/>
-            </w:pPr>
-            <w:r>
-              <w:rPr>
-                <w:b w:val="0"/>
-                <w:sz w:val="16"/>
-              </w:rPr>
-              <w:t>Repair Dispute Detail — Admin ตัดสิน C9 intervention</w:t>
+            <w:shd w:val="clear" w:color="auto" w:fill="E8F0F8"/>
+            <w:vAlign w:val="center"/>
+          </w:tcPr>
+          <w:p>
+            <w:pPr>
+              <w:jc w:val="left"/>
+            </w:pPr>
+            <w:r>
+              <w:rPr>
+                <w:b w:val="0"/>
+                <w:sz w:val="16"/>
+              </w:rPr>
+              <w:t>Repair Disputes — รายการข้อพิพาทงานซ่อม</w:t>
             </w:r>
           </w:p>
         </w:tc>
         <w:tc>
           <w:tcPr>
             <w:tcW w:type="dxa" w:w="1984"/>
-            <w:shd w:val="clear" w:color="auto" w:fill="FFFFFF"/>
-            <w:vAlign w:val="center"/>
-          </w:tcPr>
-          <w:p>
-            <w:pPr>
-              <w:jc w:val="left"/>
-            </w:pPr>
-            <w:r>
-              <w:rPr>
-                <w:b w:val="0"/>
-                <w:sz w:val="16"/>
-              </w:rPr>
-              <w:t>A-04 (list)</w:t>
+            <w:shd w:val="clear" w:color="auto" w:fill="E8F0F8"/>
+            <w:vAlign w:val="center"/>
+          </w:tcPr>
+          <w:p>
+            <w:pPr>
+              <w:jc w:val="left"/>
+            </w:pPr>
+            <w:r>
+              <w:rPr>
+                <w:b w:val="0"/>
+                <w:sz w:val="16"/>
+              </w:rPr>
+              <w:t>A-01 (sidebar) · A-02 (tab)</w:t>
             </w:r>
           </w:p>
         </w:tc>
         <w:tc>
           <w:tcPr>
             <w:tcW w:type="dxa" w:w="1984"/>
-            <w:shd w:val="clear" w:color="auto" w:fill="FFFFFF"/>
-            <w:vAlign w:val="center"/>
-          </w:tcPr>
-          <w:p>
-            <w:pPr>
-              <w:jc w:val="left"/>
-            </w:pPr>
-            <w:r>
-              <w:rPr>
-                <w:b w:val="0"/>
-                <w:sz w:val="16"/>
-              </w:rPr>
-              <w:t>คลิกรายการข้อพิพาท</w:t>
+            <w:shd w:val="clear" w:color="auto" w:fill="E8F0F8"/>
+            <w:vAlign w:val="center"/>
+          </w:tcPr>
+          <w:p>
+            <w:pPr>
+              <w:jc w:val="left"/>
+            </w:pPr>
+            <w:r>
+              <w:rPr>
+                <w:b w:val="0"/>
+                <w:sz w:val="16"/>
+              </w:rPr>
+              <w:t>มีข้อพิพาท C9</w:t>
             </w:r>
           </w:p>
         </w:tc>
         <w:tc>
           <w:tcPr>
             <w:tcW w:type="dxa" w:w="1984"/>
-            <w:shd w:val="clear" w:color="auto" w:fill="FFFFFF"/>
-            <w:vAlign w:val="center"/>
-          </w:tcPr>
-          <w:p>
-            <w:pPr>
-              <w:jc w:val="left"/>
-            </w:pPr>
-            <w:r>
-              <w:rPr>
-                <w:b w:val="0"/>
-                <w:sz w:val="16"/>
-              </w:rPr>
-              <w:t>A-04 (back หลังตัดสิน)</w:t>
+            <w:shd w:val="clear" w:color="auto" w:fill="E8F0F8"/>
+            <w:vAlign w:val="center"/>
+          </w:tcPr>
+          <w:p>
+            <w:pPr>
+              <w:jc w:val="left"/>
+            </w:pPr>
+            <w:r>
+              <w:rPr>
+                <w:b w:val="0"/>
+                <w:sz w:val="16"/>
+              </w:rPr>
+              <w:t>A-05 Dispute Detail</w:t>
             </w:r>
           </w:p>
         </w:tc>
         <w:tc>
           <w:tcPr>
             <w:tcW w:type="dxa" w:w="1984"/>
-            <w:shd w:val="clear" w:color="auto" w:fill="FFFFFF"/>
-            <w:vAlign w:val="center"/>
-          </w:tcPr>
-          <w:p>
-            <w:pPr>
-              <w:jc w:val="left"/>
-            </w:pPr>
-            <w:r>
-              <w:rPr>
-                <w:b w:val="0"/>
-                <w:sz w:val="16"/>
-              </w:rPr>
-              <w:t>WeeeU: U-04 รับผลตัดสิน · WeeeR: R-11 รับผลตัดสิน</w:t>
+            <w:shd w:val="clear" w:color="auto" w:fill="E8F0F8"/>
+            <w:vAlign w:val="center"/>
+          </w:tcPr>
+          <w:p>
+            <w:pPr>
+              <w:jc w:val="left"/>
+            </w:pPr>
+            <w:r>
+              <w:rPr>
+                <w:b w:val="0"/>
+                <w:sz w:val="16"/>
+              </w:rPr>
+              <w:t>WeeeU: U-04 เห็นสถานะ dispute · WeeeR: R-11 เห็นสถานะ C9</w:t>
             </w:r>
           </w:p>
         </w:tc>
         <w:tc>
           <w:tcPr>
             <w:tcW w:type="dxa" w:w="1134"/>
-            <w:shd w:val="clear" w:color="auto" w:fill="FFFFFF"/>
+            <w:shd w:val="clear" w:color="auto" w:fill="E8F0F8"/>
             <w:vAlign w:val="center"/>
           </w:tcPr>
           <w:p>
@@ -1062,38 +1062,38 @@
         <w:tc>
           <w:tcPr>
             <w:tcW w:type="dxa" w:w="2551"/>
-            <w:shd w:val="clear" w:color="auto" w:fill="FFFFFF"/>
-            <w:vAlign w:val="center"/>
-          </w:tcPr>
-          <w:p>
-            <w:pPr>
-              <w:jc w:val="left"/>
-            </w:pPr>
-            <w:r>
-              <w:rPr>
-                <w:b w:val="0"/>
-                <w:sz w:val="16"/>
-              </w:rPr>
-              <w:t>Admin ตัดสิน: ผู้ซื้อชนะ/ผู้ขายชนะ/แบ่ง · Escrow ปล่อยตามผล</w:t>
+            <w:shd w:val="clear" w:color="auto" w:fill="E8F0F8"/>
+            <w:vAlign w:val="center"/>
+          </w:tcPr>
+          <w:p>
+            <w:pPr>
+              <w:jc w:val="left"/>
+            </w:pPr>
+            <w:r>
+              <w:rPr>
+                <w:b w:val="0"/>
+                <w:sz w:val="16"/>
+              </w:rPr>
+              <w:t>sample: 2 รายการ pending · dispute reason: "งานไม่เป็นไปตามราคา"</w:t>
             </w:r>
           </w:p>
         </w:tc>
         <w:tc>
           <w:tcPr>
             <w:tcW w:type="dxa" w:w="2268"/>
-            <w:shd w:val="clear" w:color="auto" w:fill="FFFFFF"/>
-            <w:vAlign w:val="center"/>
-          </w:tcPr>
-          <w:p>
-            <w:pPr>
-              <w:jc w:val="left"/>
-            </w:pPr>
-            <w:r>
-              <w:rPr>
-                <w:b w:val="0"/>
-                <w:sz w:val="16"/>
-              </w:rPr>
-              <w:t>http://localhost:3000/repair/disputes/c001</w:t>
+            <w:shd w:val="clear" w:color="auto" w:fill="E8F0F8"/>
+            <w:vAlign w:val="center"/>
+          </w:tcPr>
+          <w:p>
+            <w:pPr>
+              <w:jc w:val="left"/>
+            </w:pPr>
+            <w:r>
+              <w:rPr>
+                <w:b w:val="0"/>
+                <w:sz w:val="16"/>
+              </w:rPr>
+              <w:t>http://localhost:3000/repair/disputes</w:t>
             </w:r>
           </w:p>
         </w:tc>
@@ -1102,7 +1102,7 @@
         <w:tc>
           <w:tcPr>
             <w:tcW w:type="dxa" w:w="850"/>
-            <w:shd w:val="clear" w:color="auto" w:fill="E8F0F8"/>
+            <w:shd w:val="clear" w:color="auto" w:fill="FFFFFF"/>
             <w:vAlign w:val="center"/>
           </w:tcPr>
           <w:p>
@@ -1115,159 +1115,159 @@
                 <w:color w:val="2C5E8C"/>
                 <w:sz w:val="17"/>
               </w:rPr>
-              <w:t>A-06</w:t>
+              <w:t>A-05</w:t>
             </w:r>
           </w:p>
         </w:tc>
         <w:tc>
           <w:tcPr>
             <w:tcW w:type="dxa" w:w="2551"/>
-            <w:shd w:val="clear" w:color="auto" w:fill="E8F0F8"/>
-            <w:vAlign w:val="center"/>
-          </w:tcPr>
-          <w:p>
-            <w:pPr>
-              <w:jc w:val="left"/>
-            </w:pPr>
-            <w:r>
-              <w:rPr>
-                <w:b w:val="0"/>
-                <w:sz w:val="16"/>
-              </w:rPr>
-              <w:t>Maintain Jobs — รายการงานบำรุงรักษาทั้งระบบ</w:t>
+            <w:shd w:val="clear" w:color="auto" w:fill="FFFFFF"/>
+            <w:vAlign w:val="center"/>
+          </w:tcPr>
+          <w:p>
+            <w:pPr>
+              <w:jc w:val="left"/>
+            </w:pPr>
+            <w:r>
+              <w:rPr>
+                <w:b w:val="0"/>
+                <w:sz w:val="16"/>
+              </w:rPr>
+              <w:t>Repair Dispute Detail — Admin ตัดสิน C9 intervention</w:t>
             </w:r>
           </w:p>
         </w:tc>
         <w:tc>
           <w:tcPr>
             <w:tcW w:type="dxa" w:w="1984"/>
-            <w:shd w:val="clear" w:color="auto" w:fill="E8F0F8"/>
-            <w:vAlign w:val="center"/>
-          </w:tcPr>
-          <w:p>
-            <w:pPr>
-              <w:jc w:val="left"/>
-            </w:pPr>
-            <w:r>
-              <w:rPr>
-                <w:b w:val="0"/>
-                <w:sz w:val="16"/>
-              </w:rPr>
-              <w:t>A-01 (sidebar) · A-07 (back)</w:t>
+            <w:shd w:val="clear" w:color="auto" w:fill="FFFFFF"/>
+            <w:vAlign w:val="center"/>
+          </w:tcPr>
+          <w:p>
+            <w:pPr>
+              <w:jc w:val="left"/>
+            </w:pPr>
+            <w:r>
+              <w:rPr>
+                <w:b w:val="0"/>
+                <w:sz w:val="16"/>
+              </w:rPr>
+              <w:t>A-04 (list)</w:t>
             </w:r>
           </w:p>
         </w:tc>
         <w:tc>
           <w:tcPr>
             <w:tcW w:type="dxa" w:w="1984"/>
-            <w:shd w:val="clear" w:color="auto" w:fill="E8F0F8"/>
-            <w:vAlign w:val="center"/>
-          </w:tcPr>
-          <w:p>
-            <w:pPr>
-              <w:jc w:val="left"/>
-            </w:pPr>
-            <w:r>
-              <w:rPr>
-                <w:b w:val="0"/>
-                <w:sz w:val="16"/>
-              </w:rPr>
-              <w:t>Admin ดูงานบำรุง M1-M9</w:t>
+            <w:shd w:val="clear" w:color="auto" w:fill="FFFFFF"/>
+            <w:vAlign w:val="center"/>
+          </w:tcPr>
+          <w:p>
+            <w:pPr>
+              <w:jc w:val="left"/>
+            </w:pPr>
+            <w:r>
+              <w:rPr>
+                <w:b w:val="0"/>
+                <w:sz w:val="16"/>
+              </w:rPr>
+              <w:t>คลิกรายการข้อพิพาท</w:t>
             </w:r>
           </w:p>
         </w:tc>
         <w:tc>
           <w:tcPr>
             <w:tcW w:type="dxa" w:w="1984"/>
-            <w:shd w:val="clear" w:color="auto" w:fill="E8F0F8"/>
-            <w:vAlign w:val="center"/>
-          </w:tcPr>
-          <w:p>
-            <w:pPr>
-              <w:jc w:val="left"/>
-            </w:pPr>
-            <w:r>
-              <w:rPr>
-                <w:b w:val="0"/>
-                <w:sz w:val="16"/>
-              </w:rPr>
-              <w:t>A-07 Job Detail · A-31 Analytics · A-32 Recurring</w:t>
+            <w:shd w:val="clear" w:color="auto" w:fill="FFFFFF"/>
+            <w:vAlign w:val="center"/>
+          </w:tcPr>
+          <w:p>
+            <w:pPr>
+              <w:jc w:val="left"/>
+            </w:pPr>
+            <w:r>
+              <w:rPr>
+                <w:b w:val="0"/>
+                <w:sz w:val="16"/>
+              </w:rPr>
+              <w:t>A-04 (back หลังตัดสิน)</w:t>
             </w:r>
           </w:p>
         </w:tc>
         <w:tc>
           <w:tcPr>
             <w:tcW w:type="dxa" w:w="1984"/>
-            <w:shd w:val="clear" w:color="auto" w:fill="E8F0F8"/>
-            <w:vAlign w:val="center"/>
-          </w:tcPr>
-          <w:p>
-            <w:pPr>
-              <w:jc w:val="left"/>
-            </w:pPr>
-            <w:r>
-              <w:rPr>
-                <w:b w:val="0"/>
-                <w:sz w:val="16"/>
-              </w:rPr>
-              <w:t>WeeeU: U-16 ดูงาน · WeeeR: R-14 ดูงาน · WeeeT: T-11 ดูงาน</w:t>
+            <w:shd w:val="clear" w:color="auto" w:fill="FFFFFF"/>
+            <w:vAlign w:val="center"/>
+          </w:tcPr>
+          <w:p>
+            <w:pPr>
+              <w:jc w:val="left"/>
+            </w:pPr>
+            <w:r>
+              <w:rPr>
+                <w:b w:val="0"/>
+                <w:sz w:val="16"/>
+              </w:rPr>
+              <w:t>WeeeU: U-04 รับผลตัดสิน · WeeeR: R-11 รับผลตัดสิน</w:t>
             </w:r>
           </w:p>
         </w:tc>
         <w:tc>
           <w:tcPr>
             <w:tcW w:type="dxa" w:w="1134"/>
-            <w:shd w:val="clear" w:color="auto" w:fill="E8F0F8"/>
-            <w:vAlign w:val="center"/>
-          </w:tcPr>
-          <w:p>
-            <w:pPr>
-              <w:jc w:val="left"/>
-            </w:pPr>
-            <w:r>
-              <w:rPr>
-                <w:b w:val="0"/>
-                <w:sz w:val="16"/>
-              </w:rPr>
-              <w:t>M1-M9</w:t>
+            <w:shd w:val="clear" w:color="auto" w:fill="FFFFFF"/>
+            <w:vAlign w:val="center"/>
+          </w:tcPr>
+          <w:p>
+            <w:pPr>
+              <w:jc w:val="left"/>
+            </w:pPr>
+            <w:r>
+              <w:rPr>
+                <w:b w:val="0"/>
+                <w:sz w:val="16"/>
+              </w:rPr>
+              <w:t>C9</w:t>
             </w:r>
           </w:p>
         </w:tc>
         <w:tc>
           <w:tcPr>
             <w:tcW w:type="dxa" w:w="2551"/>
-            <w:shd w:val="clear" w:color="auto" w:fill="E8F0F8"/>
-            <w:vAlign w:val="center"/>
-          </w:tcPr>
-          <w:p>
-            <w:pPr>
-              <w:jc w:val="left"/>
-            </w:pPr>
-            <w:r>
-              <w:rPr>
-                <w:b w:val="0"/>
-                <w:sz w:val="16"/>
-              </w:rPr>
-              <w:t>sample: 12 งาน active · สถานะ: scheduled/in_progress/completed</w:t>
+            <w:shd w:val="clear" w:color="auto" w:fill="FFFFFF"/>
+            <w:vAlign w:val="center"/>
+          </w:tcPr>
+          <w:p>
+            <w:pPr>
+              <w:jc w:val="left"/>
+            </w:pPr>
+            <w:r>
+              <w:rPr>
+                <w:b w:val="0"/>
+                <w:sz w:val="16"/>
+              </w:rPr>
+              <w:t>Admin ตัดสิน: ผู้ซื้อชนะ/ผู้ขายชนะ/แบ่ง · Escrow ปล่อยตามผล</w:t>
             </w:r>
           </w:p>
         </w:tc>
         <w:tc>
           <w:tcPr>
             <w:tcW w:type="dxa" w:w="2268"/>
-            <w:shd w:val="clear" w:color="auto" w:fill="E8F0F8"/>
-            <w:vAlign w:val="center"/>
-          </w:tcPr>
-          <w:p>
-            <w:pPr>
-              <w:jc w:val="left"/>
-            </w:pPr>
-            <w:r>
-              <w:rPr>
-                <w:b w:val="0"/>
-                <w:sz w:val="16"/>
-              </w:rPr>
-              <w:t>http://localhost:3000/maintain/jobs</w:t>
+            <w:shd w:val="clear" w:color="auto" w:fill="FFFFFF"/>
+            <w:vAlign w:val="center"/>
+          </w:tcPr>
+          <w:p>
+            <w:pPr>
+              <w:jc w:val="left"/>
+            </w:pPr>
+            <w:r>
+              <w:rPr>
+                <w:b w:val="0"/>
+                <w:sz w:val="16"/>
+              </w:rPr>
+              <w:t>http://localhost:3000/repair/disputes/c001</w:t>
             </w:r>
           </w:p>
         </w:tc>
@@ -1276,7 +1276,7 @@
         <w:tc>
           <w:tcPr>
             <w:tcW w:type="dxa" w:w="850"/>
-            <w:shd w:val="clear" w:color="auto" w:fill="FFFFFF"/>
+            <w:shd w:val="clear" w:color="auto" w:fill="E8F0F8"/>
             <w:vAlign w:val="center"/>
           </w:tcPr>
           <w:p>
@@ -1289,109 +1289,109 @@
                 <w:color w:val="2C5E8C"/>
                 <w:sz w:val="17"/>
               </w:rPr>
-              <w:t>A-07</w:t>
+              <w:t>A-06</w:t>
             </w:r>
           </w:p>
         </w:tc>
         <w:tc>
           <w:tcPr>
             <w:tcW w:type="dxa" w:w="2551"/>
-            <w:shd w:val="clear" w:color="auto" w:fill="FFFFFF"/>
-            <w:vAlign w:val="center"/>
-          </w:tcPr>
-          <w:p>
-            <w:pPr>
-              <w:jc w:val="left"/>
-            </w:pPr>
-            <w:r>
-              <w:rPr>
-                <w:b w:val="0"/>
-                <w:sz w:val="16"/>
-              </w:rPr>
-              <w:t>Maintain Job Detail — รายละเอียดงานบำรุง timeline</w:t>
+            <w:shd w:val="clear" w:color="auto" w:fill="E8F0F8"/>
+            <w:vAlign w:val="center"/>
+          </w:tcPr>
+          <w:p>
+            <w:pPr>
+              <w:jc w:val="left"/>
+            </w:pPr>
+            <w:r>
+              <w:rPr>
+                <w:b w:val="0"/>
+                <w:sz w:val="16"/>
+              </w:rPr>
+              <w:t>Maintain Jobs — รายการงานบำรุงรักษาทั้งระบบ</w:t>
             </w:r>
           </w:p>
         </w:tc>
         <w:tc>
           <w:tcPr>
             <w:tcW w:type="dxa" w:w="1984"/>
-            <w:shd w:val="clear" w:color="auto" w:fill="FFFFFF"/>
-            <w:vAlign w:val="center"/>
-          </w:tcPr>
-          <w:p>
-            <w:pPr>
-              <w:jc w:val="left"/>
-            </w:pPr>
-            <w:r>
-              <w:rPr>
-                <w:b w:val="0"/>
-                <w:sz w:val="16"/>
-              </w:rPr>
-              <w:t>A-06 (list)</w:t>
+            <w:shd w:val="clear" w:color="auto" w:fill="E8F0F8"/>
+            <w:vAlign w:val="center"/>
+          </w:tcPr>
+          <w:p>
+            <w:pPr>
+              <w:jc w:val="left"/>
+            </w:pPr>
+            <w:r>
+              <w:rPr>
+                <w:b w:val="0"/>
+                <w:sz w:val="16"/>
+              </w:rPr>
+              <w:t>A-01 (sidebar) · A-07 (back)</w:t>
             </w:r>
           </w:p>
         </w:tc>
         <w:tc>
           <w:tcPr>
             <w:tcW w:type="dxa" w:w="1984"/>
-            <w:shd w:val="clear" w:color="auto" w:fill="FFFFFF"/>
-            <w:vAlign w:val="center"/>
-          </w:tcPr>
-          <w:p>
-            <w:pPr>
-              <w:jc w:val="left"/>
-            </w:pPr>
-            <w:r>
-              <w:rPr>
-                <w:b w:val="0"/>
-                <w:sz w:val="16"/>
-              </w:rPr>
-              <w:t>คลิกรายการงานบำรุง | variant: [A-07c] Maintain Job M9-Cancelled — mockup state ยกเลิก M9 · เงื่อนไข: สถานะ M9 (ยกเลิก) · เคส: M9 · หมายเหตุ: mockup แสดงสถานะ cancelled · พอยต์ทองที่ล็อกคืน WeeeU</w:t>
+            <w:shd w:val="clear" w:color="auto" w:fill="E8F0F8"/>
+            <w:vAlign w:val="center"/>
+          </w:tcPr>
+          <w:p>
+            <w:pPr>
+              <w:jc w:val="left"/>
+            </w:pPr>
+            <w:r>
+              <w:rPr>
+                <w:b w:val="0"/>
+                <w:sz w:val="16"/>
+              </w:rPr>
+              <w:t>Admin ดูงานบำรุง M1-M9</w:t>
             </w:r>
           </w:p>
         </w:tc>
         <w:tc>
           <w:tcPr>
             <w:tcW w:type="dxa" w:w="1984"/>
-            <w:shd w:val="clear" w:color="auto" w:fill="FFFFFF"/>
-            <w:vAlign w:val="center"/>
-          </w:tcPr>
-          <w:p>
-            <w:pPr>
-              <w:jc w:val="left"/>
-            </w:pPr>
-            <w:r>
-              <w:rPr>
-                <w:b w:val="0"/>
-                <w:sz w:val="16"/>
-              </w:rPr>
-              <w:t>A-06 (back) · A-07 (state-c) (M9 cancel state)</w:t>
+            <w:shd w:val="clear" w:color="auto" w:fill="E8F0F8"/>
+            <w:vAlign w:val="center"/>
+          </w:tcPr>
+          <w:p>
+            <w:pPr>
+              <w:jc w:val="left"/>
+            </w:pPr>
+            <w:r>
+              <w:rPr>
+                <w:b w:val="0"/>
+                <w:sz w:val="16"/>
+              </w:rPr>
+              <w:t>A-07 Job Detail · A-31 Analytics · A-32 Recurring</w:t>
             </w:r>
           </w:p>
         </w:tc>
         <w:tc>
           <w:tcPr>
             <w:tcW w:type="dxa" w:w="1984"/>
-            <w:shd w:val="clear" w:color="auto" w:fill="FFFFFF"/>
-            <w:vAlign w:val="center"/>
-          </w:tcPr>
-          <w:p>
-            <w:pPr>
-              <w:jc w:val="left"/>
-            </w:pPr>
-            <w:r>
-              <w:rPr>
-                <w:b w:val="0"/>
-                <w:sz w:val="16"/>
-              </w:rPr>
-              <w:t>WeeeU: U-16 ดูงาน · WeeeR: R-14 ดูงาน · WeeeT: T-08/T-09</w:t>
+            <w:shd w:val="clear" w:color="auto" w:fill="E8F0F8"/>
+            <w:vAlign w:val="center"/>
+          </w:tcPr>
+          <w:p>
+            <w:pPr>
+              <w:jc w:val="left"/>
+            </w:pPr>
+            <w:r>
+              <w:rPr>
+                <w:b w:val="0"/>
+                <w:sz w:val="16"/>
+              </w:rPr>
+              <w:t>WeeeU: U-16 ดูงาน · WeeeR: R-14 ดูงาน · WeeeT: T-11 ดูงาน</w:t>
             </w:r>
           </w:p>
         </w:tc>
         <w:tc>
           <w:tcPr>
             <w:tcW w:type="dxa" w:w="1134"/>
-            <w:shd w:val="clear" w:color="auto" w:fill="FFFFFF"/>
+            <w:shd w:val="clear" w:color="auto" w:fill="E8F0F8"/>
             <w:vAlign w:val="center"/>
           </w:tcPr>
           <w:p>
@@ -1410,38 +1410,38 @@
         <w:tc>
           <w:tcPr>
             <w:tcW w:type="dxa" w:w="2551"/>
-            <w:shd w:val="clear" w:color="auto" w:fill="FFFFFF"/>
-            <w:vAlign w:val="center"/>
-          </w:tcPr>
-          <w:p>
-            <w:pPr>
-              <w:jc w:val="left"/>
-            </w:pPr>
-            <w:r>
-              <w:rPr>
-                <w:b w:val="0"/>
-                <w:sz w:val="16"/>
-              </w:rPr>
-              <w:t>sample: MAINT-2024-005 · WeeeU: สมหญิง ข. · บ้านเลขที่ 55 · สัญญา 6 เดือน</w:t>
+            <w:shd w:val="clear" w:color="auto" w:fill="E8F0F8"/>
+            <w:vAlign w:val="center"/>
+          </w:tcPr>
+          <w:p>
+            <w:pPr>
+              <w:jc w:val="left"/>
+            </w:pPr>
+            <w:r>
+              <w:rPr>
+                <w:b w:val="0"/>
+                <w:sz w:val="16"/>
+              </w:rPr>
+              <w:t>sample: 12 งาน active · สถานะ: scheduled/in_progress/completed</w:t>
             </w:r>
           </w:p>
         </w:tc>
         <w:tc>
           <w:tcPr>
             <w:tcW w:type="dxa" w:w="2268"/>
-            <w:shd w:val="clear" w:color="auto" w:fill="FFFFFF"/>
-            <w:vAlign w:val="center"/>
-          </w:tcPr>
-          <w:p>
-            <w:pPr>
-              <w:jc w:val="left"/>
-            </w:pPr>
-            <w:r>
-              <w:rPr>
-                <w:b w:val="0"/>
-                <w:sz w:val="16"/>
-              </w:rPr>
-              <w:t>http://localhost:3000/maintain/jobs/m001</w:t>
+            <w:shd w:val="clear" w:color="auto" w:fill="E8F0F8"/>
+            <w:vAlign w:val="center"/>
+          </w:tcPr>
+          <w:p>
+            <w:pPr>
+              <w:jc w:val="left"/>
+            </w:pPr>
+            <w:r>
+              <w:rPr>
+                <w:b w:val="0"/>
+                <w:sz w:val="16"/>
+              </w:rPr>
+              <w:t>http://localhost:3000/maintain/jobs</w:t>
             </w:r>
           </w:p>
         </w:tc>
@@ -1463,7 +1463,7 @@
                 <w:color w:val="2C5E8C"/>
                 <w:sz w:val="17"/>
               </w:rPr>
-              <w:t>A-08</w:t>
+              <w:t>A-07</w:t>
             </w:r>
           </w:p>
         </w:tc>
@@ -1482,7 +1482,7 @@
                 <w:b w:val="0"/>
                 <w:sz w:val="16"/>
               </w:rPr>
-              <w:t>Scrap Jobs — รายการงานซากทั้งระบบ</w:t>
+              <w:t>Maintain Job Detail — รายละเอียดงานบำรุง timeline</w:t>
             </w:r>
           </w:p>
         </w:tc>
@@ -1501,7 +1501,7 @@
                 <w:b w:val="0"/>
                 <w:sz w:val="16"/>
               </w:rPr>
-              <w:t>A-01 (sidebar) · A-08 (state-b) (back)</w:t>
+              <w:t>A-06 (list)</w:t>
             </w:r>
           </w:p>
         </w:tc>
@@ -1520,7 +1520,7 @@
                 <w:b w:val="0"/>
                 <w:sz w:val="16"/>
               </w:rPr>
-              <w:t>Admin ดูงานซาก S1-S12 | variant: [A-08b] Scrap Job Detail — รายละเอียดงานซาก · เงื่อนไข: คลิกรายการงานซาก · เคส: S1-S12 · หมายเหตุ: sample: SCRAP-2024-003 · น้ำหนัก 15 กก. · ราคาซาก 450 บาท</w:t>
+              <w:t>คลิกรายการงานบำรุง | variant: [A-07c] Maintain Job M9-Cancelled — mockup state ยกเลิก M9 · เงื่อนไข: สถานะ M9 (ยกเลิก) · เคส: M9 · หมายเหตุ: mockup แสดงสถานะ cancelled · พอยต์ทองที่ล็อกคืน WeeeU</w:t>
             </w:r>
           </w:p>
         </w:tc>
@@ -1539,7 +1539,7 @@
                 <w:b w:val="0"/>
                 <w:sz w:val="16"/>
               </w:rPr>
-              <w:t>A-08 (state-b) Job Detail · A-09 Disputes</w:t>
+              <w:t>A-06 (back) · A-07 (state-c) (M9 cancel state)</w:t>
             </w:r>
           </w:p>
         </w:tc>
@@ -1558,7 +1558,7 @@
                 <w:b w:val="0"/>
                 <w:sz w:val="16"/>
               </w:rPr>
-              <w:t>WeeeU: U-33 ดูสถานะ · WeeeR: R-27/R-28 ดูงาน · WeeeT: T-04 รับขนส่ง</w:t>
+              <w:t>WeeeU: U-16 ดูงาน · WeeeR: R-14 ดูงาน · WeeeT: T-08/T-09</w:t>
             </w:r>
           </w:p>
         </w:tc>
@@ -1577,7 +1577,7 @@
                 <w:b w:val="0"/>
                 <w:sz w:val="16"/>
               </w:rPr>
-              <w:t>S1-S12</w:t>
+              <w:t>M1-M9</w:t>
             </w:r>
           </w:p>
         </w:tc>
@@ -1596,7 +1596,7 @@
                 <w:b w:val="0"/>
                 <w:sz w:val="16"/>
               </w:rPr>
-              <w:t>sample: 8 งาน · S4: ออกใบรับรอง · S6/S9: รับซาก</w:t>
+              <w:t>sample: MAINT-2024-005 · WeeeU: สมหญิง ข. · บ้านเลขที่ 55 · สัญญา 6 เดือน</w:t>
             </w:r>
           </w:p>
         </w:tc>
@@ -1615,7 +1615,529 @@
                 <w:b w:val="0"/>
                 <w:sz w:val="16"/>
               </w:rPr>
+              <w:t>http://localhost:3000/maintain/jobs/m001</w:t>
+            </w:r>
+          </w:p>
+        </w:tc>
+      </w:tr>
+      <w:tr>
+        <w:tc>
+          <w:tcPr>
+            <w:tcW w:type="dxa" w:w="850"/>
+            <w:shd w:val="clear" w:color="auto" w:fill="FFF9C4"/>
+            <w:vAlign w:val="center"/>
+          </w:tcPr>
+          <w:p>
+            <w:pPr>
+              <w:jc w:val="left"/>
+            </w:pPr>
+            <w:r>
+              <w:rPr>
+                <w:b/>
+                <w:color w:val="2C5E8C"/>
+                <w:sz w:val="17"/>
+              </w:rPr>
+              <w:t>A-07c</w:t>
+            </w:r>
+          </w:p>
+        </w:tc>
+        <w:tc>
+          <w:tcPr>
+            <w:tcW w:type="dxa" w:w="2551"/>
+            <w:shd w:val="clear" w:color="auto" w:fill="FFF9C4"/>
+            <w:vAlign w:val="center"/>
+          </w:tcPr>
+          <w:p>
+            <w:pPr>
+              <w:jc w:val="left"/>
+            </w:pPr>
+            <w:r>
+              <w:rPr>
+                <w:b w:val="0"/>
+                <w:sz w:val="16"/>
+              </w:rPr>
+              <w:t>Maintain Job M9-Cancelled — mockup state ยกเลิกกลางคัน</w:t>
+            </w:r>
+          </w:p>
+        </w:tc>
+        <w:tc>
+          <w:tcPr>
+            <w:tcW w:type="dxa" w:w="1984"/>
+            <w:shd w:val="clear" w:color="auto" w:fill="FFF9C4"/>
+            <w:vAlign w:val="center"/>
+          </w:tcPr>
+          <w:p>
+            <w:pPr>
+              <w:jc w:val="left"/>
+            </w:pPr>
+            <w:r>
+              <w:rPr>
+                <w:b w:val="0"/>
+                <w:sz w:val="16"/>
+              </w:rPr>
+              <w:t>A-07 (state M9)</w:t>
+            </w:r>
+          </w:p>
+        </w:tc>
+        <w:tc>
+          <w:tcPr>
+            <w:tcW w:type="dxa" w:w="1984"/>
+            <w:shd w:val="clear" w:color="auto" w:fill="FFF9C4"/>
+            <w:vAlign w:val="center"/>
+          </w:tcPr>
+          <w:p>
+            <w:pPr>
+              <w:jc w:val="left"/>
+            </w:pPr>
+            <w:r>
+              <w:rPr>
+                <w:b w:val="0"/>
+                <w:sz w:val="16"/>
+              </w:rPr>
+              <w:t>สถานะ M9 cancelled_inprogress · mockup รอ settle</w:t>
+            </w:r>
+          </w:p>
+        </w:tc>
+        <w:tc>
+          <w:tcPr>
+            <w:tcW w:type="dxa" w:w="1984"/>
+            <w:shd w:val="clear" w:color="auto" w:fill="FFF9C4"/>
+            <w:vAlign w:val="center"/>
+          </w:tcPr>
+          <w:p>
+            <w:pPr>
+              <w:jc w:val="left"/>
+            </w:pPr>
+            <w:r>
+              <w:rPr>
+                <w:b w:val="0"/>
+                <w:sz w:val="16"/>
+              </w:rPr>
+              <w:t>A-06 (back)</w:t>
+            </w:r>
+          </w:p>
+        </w:tc>
+        <w:tc>
+          <w:tcPr>
+            <w:tcW w:type="dxa" w:w="1984"/>
+            <w:shd w:val="clear" w:color="auto" w:fill="FFF9C4"/>
+            <w:vAlign w:val="center"/>
+          </w:tcPr>
+          <w:p>
+            <w:pPr>
+              <w:jc w:val="left"/>
+            </w:pPr>
+            <w:r>
+              <w:rPr>
+                <w:b w:val="0"/>
+                <w:sz w:val="16"/>
+              </w:rPr>
+              <w:t>WeeeU: U-16 ดูงาน</w:t>
+            </w:r>
+          </w:p>
+        </w:tc>
+        <w:tc>
+          <w:tcPr>
+            <w:tcW w:type="dxa" w:w="1134"/>
+            <w:shd w:val="clear" w:color="auto" w:fill="FFF9C4"/>
+            <w:vAlign w:val="center"/>
+          </w:tcPr>
+          <w:p>
+            <w:pPr>
+              <w:jc w:val="left"/>
+            </w:pPr>
+            <w:r>
+              <w:rPr>
+                <w:b w:val="0"/>
+                <w:sz w:val="16"/>
+              </w:rPr>
+              <w:t>M9</w:t>
+            </w:r>
+          </w:p>
+        </w:tc>
+        <w:tc>
+          <w:tcPr>
+            <w:tcW w:type="dxa" w:w="2551"/>
+            <w:shd w:val="clear" w:color="auto" w:fill="FFF9C4"/>
+            <w:vAlign w:val="center"/>
+          </w:tcPr>
+          <w:p>
+            <w:pPr>
+              <w:jc w:val="left"/>
+            </w:pPr>
+            <w:r>
+              <w:rPr>
+                <w:b w:val="0"/>
+                <w:sz w:val="16"/>
+              </w:rPr>
+              <w:t>sample: MAINT-2024-005 · cancelled_inprogress</w:t>
+            </w:r>
+          </w:p>
+        </w:tc>
+        <w:tc>
+          <w:tcPr>
+            <w:tcW w:type="dxa" w:w="2268"/>
+            <w:shd w:val="clear" w:color="auto" w:fill="FFF9C4"/>
+            <w:vAlign w:val="center"/>
+          </w:tcPr>
+          <w:p>
+            <w:pPr>
+              <w:jc w:val="left"/>
+            </w:pPr>
+            <w:r>
+              <w:rPr>
+                <w:b w:val="0"/>
+                <w:sz w:val="16"/>
+              </w:rPr>
+              <w:t>http://localhost:3000/maintain/jobs/m001/mockup/m9-cancelled</w:t>
+            </w:r>
+          </w:p>
+        </w:tc>
+      </w:tr>
+      <w:tr>
+        <w:tc>
+          <w:tcPr>
+            <w:tcW w:type="dxa" w:w="850"/>
+            <w:shd w:val="clear" w:color="auto" w:fill="FFFFFF"/>
+            <w:vAlign w:val="center"/>
+          </w:tcPr>
+          <w:p>
+            <w:pPr>
+              <w:jc w:val="left"/>
+            </w:pPr>
+            <w:r>
+              <w:rPr>
+                <w:b/>
+                <w:color w:val="2C5E8C"/>
+                <w:sz w:val="17"/>
+              </w:rPr>
+              <w:t>A-08</w:t>
+            </w:r>
+          </w:p>
+        </w:tc>
+        <w:tc>
+          <w:tcPr>
+            <w:tcW w:type="dxa" w:w="2551"/>
+            <w:shd w:val="clear" w:color="auto" w:fill="FFFFFF"/>
+            <w:vAlign w:val="center"/>
+          </w:tcPr>
+          <w:p>
+            <w:pPr>
+              <w:jc w:val="left"/>
+            </w:pPr>
+            <w:r>
+              <w:rPr>
+                <w:b w:val="0"/>
+                <w:sz w:val="16"/>
+              </w:rPr>
+              <w:t>Scrap Jobs — รายการงานซากทั้งระบบ</w:t>
+            </w:r>
+          </w:p>
+        </w:tc>
+        <w:tc>
+          <w:tcPr>
+            <w:tcW w:type="dxa" w:w="1984"/>
+            <w:shd w:val="clear" w:color="auto" w:fill="FFFFFF"/>
+            <w:vAlign w:val="center"/>
+          </w:tcPr>
+          <w:p>
+            <w:pPr>
+              <w:jc w:val="left"/>
+            </w:pPr>
+            <w:r>
+              <w:rPr>
+                <w:b w:val="0"/>
+                <w:sz w:val="16"/>
+              </w:rPr>
+              <w:t>A-01 (sidebar) · A-08 (state-b) (back)</w:t>
+            </w:r>
+          </w:p>
+        </w:tc>
+        <w:tc>
+          <w:tcPr>
+            <w:tcW w:type="dxa" w:w="1984"/>
+            <w:shd w:val="clear" w:color="auto" w:fill="FFFFFF"/>
+            <w:vAlign w:val="center"/>
+          </w:tcPr>
+          <w:p>
+            <w:pPr>
+              <w:jc w:val="left"/>
+            </w:pPr>
+            <w:r>
+              <w:rPr>
+                <w:b w:val="0"/>
+                <w:sz w:val="16"/>
+              </w:rPr>
+              <w:t>Admin ดูงานซาก S1-S12 | variant: [A-08b] Scrap Job Detail — รายละเอียดงานซาก · เงื่อนไข: คลิกรายการงานซาก · เคส: S1-S12 · หมายเหตุ: sample: SCRAP-2024-003 · น้ำหนัก 15 กก. · ราคาซาก 450 บาท</w:t>
+            </w:r>
+          </w:p>
+        </w:tc>
+        <w:tc>
+          <w:tcPr>
+            <w:tcW w:type="dxa" w:w="1984"/>
+            <w:shd w:val="clear" w:color="auto" w:fill="FFFFFF"/>
+            <w:vAlign w:val="center"/>
+          </w:tcPr>
+          <w:p>
+            <w:pPr>
+              <w:jc w:val="left"/>
+            </w:pPr>
+            <w:r>
+              <w:rPr>
+                <w:b w:val="0"/>
+                <w:sz w:val="16"/>
+              </w:rPr>
+              <w:t>A-08 (state-b) Job Detail · A-09 Disputes</w:t>
+            </w:r>
+          </w:p>
+        </w:tc>
+        <w:tc>
+          <w:tcPr>
+            <w:tcW w:type="dxa" w:w="1984"/>
+            <w:shd w:val="clear" w:color="auto" w:fill="FFFFFF"/>
+            <w:vAlign w:val="center"/>
+          </w:tcPr>
+          <w:p>
+            <w:pPr>
+              <w:jc w:val="left"/>
+            </w:pPr>
+            <w:r>
+              <w:rPr>
+                <w:b w:val="0"/>
+                <w:sz w:val="16"/>
+              </w:rPr>
+              <w:t>WeeeU: U-33 ดูสถานะ · WeeeR: R-27/R-28 ดูงาน · WeeeT: T-04 รับขนส่ง</w:t>
+            </w:r>
+          </w:p>
+        </w:tc>
+        <w:tc>
+          <w:tcPr>
+            <w:tcW w:type="dxa" w:w="1134"/>
+            <w:shd w:val="clear" w:color="auto" w:fill="FFFFFF"/>
+            <w:vAlign w:val="center"/>
+          </w:tcPr>
+          <w:p>
+            <w:pPr>
+              <w:jc w:val="left"/>
+            </w:pPr>
+            <w:r>
+              <w:rPr>
+                <w:b w:val="0"/>
+                <w:sz w:val="16"/>
+              </w:rPr>
+              <w:t>S1-S12</w:t>
+            </w:r>
+          </w:p>
+        </w:tc>
+        <w:tc>
+          <w:tcPr>
+            <w:tcW w:type="dxa" w:w="2551"/>
+            <w:shd w:val="clear" w:color="auto" w:fill="FFFFFF"/>
+            <w:vAlign w:val="center"/>
+          </w:tcPr>
+          <w:p>
+            <w:pPr>
+              <w:jc w:val="left"/>
+            </w:pPr>
+            <w:r>
+              <w:rPr>
+                <w:b w:val="0"/>
+                <w:sz w:val="16"/>
+              </w:rPr>
+              <w:t>sample: 8 งาน · S4: ออกใบรับรอง · S6/S9: รับซาก</w:t>
+            </w:r>
+          </w:p>
+        </w:tc>
+        <w:tc>
+          <w:tcPr>
+            <w:tcW w:type="dxa" w:w="2268"/>
+            <w:shd w:val="clear" w:color="auto" w:fill="FFFFFF"/>
+            <w:vAlign w:val="center"/>
+          </w:tcPr>
+          <w:p>
+            <w:pPr>
+              <w:jc w:val="left"/>
+            </w:pPr>
+            <w:r>
+              <w:rPr>
+                <w:b w:val="0"/>
+                <w:sz w:val="16"/>
+              </w:rPr>
               <w:t>http://localhost:3000/scrap/jobs</w:t>
+            </w:r>
+          </w:p>
+        </w:tc>
+      </w:tr>
+      <w:tr>
+        <w:tc>
+          <w:tcPr>
+            <w:tcW w:type="dxa" w:w="850"/>
+            <w:shd w:val="clear" w:color="auto" w:fill="FFF9C4"/>
+            <w:vAlign w:val="center"/>
+          </w:tcPr>
+          <w:p>
+            <w:pPr>
+              <w:jc w:val="left"/>
+            </w:pPr>
+            <w:r>
+              <w:rPr>
+                <w:b/>
+                <w:color w:val="2C5E8C"/>
+                <w:sz w:val="17"/>
+              </w:rPr>
+              <w:t>A-08b</w:t>
+            </w:r>
+          </w:p>
+        </w:tc>
+        <w:tc>
+          <w:tcPr>
+            <w:tcW w:type="dxa" w:w="2551"/>
+            <w:shd w:val="clear" w:color="auto" w:fill="FFF9C4"/>
+            <w:vAlign w:val="center"/>
+          </w:tcPr>
+          <w:p>
+            <w:pPr>
+              <w:jc w:val="left"/>
+            </w:pPr>
+            <w:r>
+              <w:rPr>
+                <w:b w:val="0"/>
+                <w:sz w:val="16"/>
+              </w:rPr>
+              <w:t>Scrap Job Detail — รายละเอียดงานซาก</w:t>
+            </w:r>
+          </w:p>
+        </w:tc>
+        <w:tc>
+          <w:tcPr>
+            <w:tcW w:type="dxa" w:w="1984"/>
+            <w:shd w:val="clear" w:color="auto" w:fill="FFF9C4"/>
+            <w:vAlign w:val="center"/>
+          </w:tcPr>
+          <w:p>
+            <w:pPr>
+              <w:jc w:val="left"/>
+            </w:pPr>
+            <w:r>
+              <w:rPr>
+                <w:b w:val="0"/>
+                <w:sz w:val="16"/>
+              </w:rPr>
+              <w:t>A-08 (list tab)</w:t>
+            </w:r>
+          </w:p>
+        </w:tc>
+        <w:tc>
+          <w:tcPr>
+            <w:tcW w:type="dxa" w:w="1984"/>
+            <w:shd w:val="clear" w:color="auto" w:fill="FFF9C4"/>
+            <w:vAlign w:val="center"/>
+          </w:tcPr>
+          <w:p>
+            <w:pPr>
+              <w:jc w:val="left"/>
+            </w:pPr>
+            <w:r>
+              <w:rPr>
+                <w:b w:val="0"/>
+                <w:sz w:val="16"/>
+              </w:rPr>
+              <w:t>คลิกรายการงานซาก · ดูขั้นตอน S1-S12</w:t>
+            </w:r>
+          </w:p>
+        </w:tc>
+        <w:tc>
+          <w:tcPr>
+            <w:tcW w:type="dxa" w:w="1984"/>
+            <w:shd w:val="clear" w:color="auto" w:fill="FFF9C4"/>
+            <w:vAlign w:val="center"/>
+          </w:tcPr>
+          <w:p>
+            <w:pPr>
+              <w:jc w:val="left"/>
+            </w:pPr>
+            <w:r>
+              <w:rPr>
+                <w:b w:val="0"/>
+                <w:sz w:val="16"/>
+              </w:rPr>
+              <w:t>A-08 (back) · A-09 Disputes</w:t>
+            </w:r>
+          </w:p>
+        </w:tc>
+        <w:tc>
+          <w:tcPr>
+            <w:tcW w:type="dxa" w:w="1984"/>
+            <w:shd w:val="clear" w:color="auto" w:fill="FFF9C4"/>
+            <w:vAlign w:val="center"/>
+          </w:tcPr>
+          <w:p>
+            <w:pPr>
+              <w:jc w:val="left"/>
+            </w:pPr>
+            <w:r>
+              <w:rPr>
+                <w:b w:val="0"/>
+                <w:sz w:val="16"/>
+              </w:rPr>
+              <w:t>WeeeU: U-23 ดูงาน · WeeeR: R-20 จัดการ</w:t>
+            </w:r>
+          </w:p>
+        </w:tc>
+        <w:tc>
+          <w:tcPr>
+            <w:tcW w:type="dxa" w:w="1134"/>
+            <w:shd w:val="clear" w:color="auto" w:fill="FFF9C4"/>
+            <w:vAlign w:val="center"/>
+          </w:tcPr>
+          <w:p>
+            <w:pPr>
+              <w:jc w:val="left"/>
+            </w:pPr>
+            <w:r>
+              <w:rPr>
+                <w:b w:val="0"/>
+                <w:sz w:val="16"/>
+              </w:rPr>
+              <w:t>S1-S12</w:t>
+            </w:r>
+          </w:p>
+        </w:tc>
+        <w:tc>
+          <w:tcPr>
+            <w:tcW w:type="dxa" w:w="2551"/>
+            <w:shd w:val="clear" w:color="auto" w:fill="FFF9C4"/>
+            <w:vAlign w:val="center"/>
+          </w:tcPr>
+          <w:p>
+            <w:pPr>
+              <w:jc w:val="left"/>
+            </w:pPr>
+            <w:r>
+              <w:rPr>
+                <w:b w:val="0"/>
+                <w:sz w:val="16"/>
+              </w:rPr>
+              <w:t>sample: SCRAP-2024-003 · สถานะ in_progress</w:t>
+            </w:r>
+          </w:p>
+        </w:tc>
+        <w:tc>
+          <w:tcPr>
+            <w:tcW w:type="dxa" w:w="2268"/>
+            <w:shd w:val="clear" w:color="auto" w:fill="FFF9C4"/>
+            <w:vAlign w:val="center"/>
+          </w:tcPr>
+          <w:p>
+            <w:pPr>
+              <w:jc w:val="left"/>
+            </w:pPr>
+            <w:r>
+              <w:rPr>
+                <w:b w:val="0"/>
+                <w:sz w:val="16"/>
+              </w:rPr>
+              <w:t>http://localhost:3000/scrap/jobs/s001</w:t>
             </w:r>
           </w:p>
         </w:tc>

</xml_diff>